<commit_message>
feat: ATS DOCX fixes (A4, en-AU, contact labels) + resume-gen spec
Apply 2026 ATS/AU research learnings to the published resume builder:
- A4 page size (python-docx defaulted to US Letter) with 2.5 cm margins
- Set proofing language en-AU on docDefaults + Normal style
- Text labels on contact line (Phone:/Email:/LinkedIn:/Web:), no icons

Add docs/resume-generation.md — spec/contract for the role-targeted
resume + cover-letter generator (inputs, outputs, format ruleset,
per-JD company research, blocking accuracy cross-checks). KSC deferred.

Gitignore out/ (one-off tailored output) and .venv/.

Co-Authored-By: Claude Opus 4.8 (1M context) <noreply@anthropic.com>
</commit_message>
<xml_diff>
--- a/cv/docs/Paul Harvey - Resume.docx
+++ b/cv/docs/Paul Harvey - Resume.docx
@@ -41,7 +41,7 @@
           <w:i w:val="0"/>
           <w:sz w:val="20"/>
         </w:rPr>
-        <w:t>Hurstville, NSW, Australia | cv [at] paulharvey [dot] com [dot] au | https://www.linkedin.com/in/harvest316 | https://paulharvey.com.au</w:t>
+        <w:t>Hurstville, NSW, Australia | Email: cv [at] paulharvey [dot] com [dot] au | LinkedIn: https://www.linkedin.com/in/harvest316 | Web: https://paulharvey.com.au</w:t>
       </w:r>
     </w:p>
     <w:p>
@@ -3460,7 +3460,7 @@
           <w:i w:val="0"/>
           <w:sz w:val="22"/>
         </w:rPr>
-        <w:t>* Audit and Fix (https://auditandfix.com) - Website audit and remediation service - performance, SEO, security, AI-assisted video reviews of every visit.</w:t>
+        <w:t>* Audit and Fix - CRO Audits (https://auditandfix.com) - Automated Conversion Rate Optimisation audits - with cold outreach, screenshots and prioritised fixes.</w:t>
       </w:r>
     </w:p>
     <w:p>
@@ -3475,7 +3475,7 @@
           <w:i w:val="0"/>
           <w:sz w:val="22"/>
         </w:rPr>
-        <w:t>* AI Clarity (https://aiclarity.com.au) - Plain-English AI strategy and adoption advisory for Australian businesses.</w:t>
+        <w:t>* Audit and Fix - Video Reviews (https://auditandfix.com/video-reviews) - AI-generated marketing videos from 5-star reviews.</w:t>
       </w:r>
     </w:p>
     <w:p>
@@ -3490,7 +3490,7 @@
           <w:i w:val="0"/>
           <w:sz w:val="22"/>
         </w:rPr>
-        <w:t>* Vybe (https://vybe.com.au) - DJ and dance-therapy work.</w:t>
+        <w:t>* AI Clarity - Workshops (https://aiclarity.com.au) - Plain-English AI strategy and adoption workshops for local small businesses. Finish the day having automated your first business process.</w:t>
       </w:r>
     </w:p>
     <w:p>
@@ -3505,7 +3505,52 @@
           <w:i w:val="0"/>
           <w:sz w:val="22"/>
         </w:rPr>
-        <w:t>* Gumroad (https://harvest316.gumroad.com) - Independent storefront for digital downloads, templates and tooling.</w:t>
+        <w:t>* AI Clarity - Tools (https://aiclarity.com.au/tools) - Practical AI prompt packs for developers, for sale on Gumroad and Lemon Squeezy.</w:t>
+      </w:r>
+    </w:p>
+    <w:p>
+      <w:pPr>
+        <w:spacing w:before="0" w:after="40"/>
+        <w:ind w:left="288"/>
+      </w:pPr>
+      <w:r>
+        <w:rPr>
+          <w:rFonts w:ascii="Calibri" w:hAnsi="Calibri" w:cs="Calibri"/>
+          <w:b w:val="0"/>
+          <w:i w:val="0"/>
+          <w:sz w:val="22"/>
+        </w:rPr>
+        <w:t>* MinSpec (https://minspec.dev) - VS Code extension that scales spec-driven-development ceremony to change complexity - one sentence for trivial tasks, full architecture docs for big ones. No AI dependency, no backend, no lock-in.</w:t>
+      </w:r>
+    </w:p>
+    <w:p>
+      <w:pPr>
+        <w:spacing w:before="0" w:after="40"/>
+        <w:ind w:left="288"/>
+      </w:pPr>
+      <w:r>
+        <w:rPr>
+          <w:rFonts w:ascii="Calibri" w:hAnsi="Calibri" w:cs="Calibri"/>
+          <w:b w:val="0"/>
+          <w:i w:val="0"/>
+          <w:sz w:val="22"/>
+        </w:rPr>
+        <w:t>* ScroogeLLM (https://scroogellm.com) - VS Code extension that cuts LLM costs while improving quality - LLM proxy, prompt compression, agent escalation, and full savings visibility. You only pay a percentage of how much we save you.</w:t>
+      </w:r>
+    </w:p>
+    <w:p>
+      <w:pPr>
+        <w:spacing w:before="0" w:after="40"/>
+        <w:ind w:left="288"/>
+      </w:pPr>
+      <w:r>
+        <w:rPr>
+          <w:rFonts w:ascii="Calibri" w:hAnsi="Calibri" w:cs="Calibri"/>
+          <w:b w:val="0"/>
+          <w:i w:val="0"/>
+          <w:sz w:val="22"/>
+        </w:rPr>
+        <w:t>* DJ Vybe (https://vybe.com.au) - Dance Therapy. We were built to heal ourselves through movement.</w:t>
       </w:r>
     </w:p>
     <w:p>
@@ -3864,12 +3909,12 @@
           <w:i/>
           <w:sz w:val="18"/>
         </w:rPr>
-        <w:t>Live interactive resume: https://paulharvey.com.au | Generated 2026-05-29 | Source: resume.json v20260528.1</w:t>
+        <w:t>Live interactive resume: https://paulharvey.com.au | Generated 2026-06-01 | Source: resume.json v20260530.4</w:t>
       </w:r>
     </w:p>
     <w:sectPr>
-      <w:pgSz w:w="12240" w:h="15840"/>
-      <w:pgMar w:top="1440" w:right="1440" w:bottom="1440" w:left="1440" w:header="720" w:footer="720" w:gutter="0"/>
+      <w:pgSz w:w="11906" w:h="16838"/>
+      <w:pgMar w:top="1417" w:right="1417" w:bottom="1417" w:left="1417" w:header="720" w:footer="720" w:gutter="0"/>
       <w:cols w:space="720"/>
       <w:docGrid w:linePitch="360"/>
     </w:sectPr>
@@ -4088,7 +4133,7 @@
         <w:rFonts w:asciiTheme="minorHAnsi" w:eastAsiaTheme="minorEastAsia" w:hAnsiTheme="minorHAnsi" w:cstheme="minorBidi"/>
         <w:sz w:val="22"/>
         <w:szCs w:val="22"/>
-        <w:lang w:val="en-US" w:eastAsia="en-US" w:bidi="ar-SA"/>
+        <w:lang w:val="en-AU" w:eastAsia="en-US" w:bidi="ar-SA"/>
       </w:rPr>
     </w:rPrDefault>
     <w:pPrDefault>
@@ -4243,6 +4288,7 @@
     <w:rPr>
       <w:rFonts w:ascii="Calibri" w:hAnsi="Calibri"/>
       <w:sz w:val="22"/>
+      <w:lang w:val="en-AU"/>
     </w:rPr>
   </w:style>
   <w:style w:type="paragraph" w:styleId="Header">

</xml_diff>

<commit_message>
feat: ship A4 PDF master resume + condense to 8pp; wire site downloads
- Condense in place (both formats via build_blocks): certifications as one
  inline list (was 35 bullets), per-role keyword block merged to one line,
  skills matrix label folded inline, tighter heading/bullet spacing.
- PDF: lead font stack with Liberation Sans (installed; Calibri/Carlito were
  silently substituting bulky DejaVu Sans), 10pt body / 1.15 leading.
  Result: 11pp -> 8pp, all content retained, text-selectable, no PII leak.
- index.html: add PDF as the primary download (DOCX demoted to "Word
  version if your ATS prefers it"); update intro + FAQ pointer copy.
- sync-resumes.sh: include built *.pdf in the deploy staging allowlist.

Co-Authored-By: Claude Opus 4.8 (1M context) <noreply@anthropic.com>
</commit_message>
<xml_diff>
--- a/cv/docs/Paul Harvey - Resume.docx
+++ b/cv/docs/Paul Harvey - Resume.docx
@@ -54,7 +54,7 @@
     </w:p>
     <w:p>
       <w:pPr>
-        <w:spacing w:before="240" w:after="120"/>
+        <w:spacing w:before="160" w:after="60"/>
       </w:pPr>
       <w:r>
         <w:rPr>
@@ -82,7 +82,7 @@
     </w:p>
     <w:p>
       <w:pPr>
-        <w:spacing w:before="0" w:after="40"/>
+        <w:spacing w:before="0" w:after="20"/>
         <w:ind w:left="288"/>
       </w:pPr>
       <w:r>
@@ -97,7 +97,7 @@
     </w:p>
     <w:p>
       <w:pPr>
-        <w:spacing w:before="0" w:after="40"/>
+        <w:spacing w:before="0" w:after="20"/>
         <w:ind w:left="288"/>
       </w:pPr>
       <w:r>
@@ -112,7 +112,7 @@
     </w:p>
     <w:p>
       <w:pPr>
-        <w:spacing w:before="0" w:after="40"/>
+        <w:spacing w:before="0" w:after="20"/>
         <w:ind w:left="288"/>
       </w:pPr>
       <w:r>
@@ -127,7 +127,7 @@
     </w:p>
     <w:p>
       <w:pPr>
-        <w:spacing w:before="0" w:after="40"/>
+        <w:spacing w:before="0" w:after="20"/>
         <w:ind w:left="288"/>
       </w:pPr>
       <w:r>
@@ -142,7 +142,7 @@
     </w:p>
     <w:p>
       <w:pPr>
-        <w:spacing w:before="0" w:after="40"/>
+        <w:spacing w:before="0" w:after="20"/>
         <w:ind w:left="288"/>
       </w:pPr>
       <w:r>
@@ -185,7 +185,7 @@
     </w:p>
     <w:p>
       <w:pPr>
-        <w:spacing w:before="240" w:after="120"/>
+        <w:spacing w:before="160" w:after="60"/>
       </w:pPr>
       <w:r>
         <w:rPr>
@@ -227,7 +227,7 @@
     </w:p>
     <w:p>
       <w:pPr>
-        <w:spacing w:before="240" w:after="120"/>
+        <w:spacing w:before="160" w:after="60"/>
       </w:pPr>
       <w:r>
         <w:rPr>
@@ -241,7 +241,7 @@
     </w:p>
     <w:p>
       <w:pPr>
-        <w:spacing w:before="160" w:after="40"/>
+        <w:spacing w:before="120" w:after="20"/>
       </w:pPr>
       <w:r>
         <w:rPr>
@@ -283,7 +283,7 @@
     </w:p>
     <w:p>
       <w:pPr>
-        <w:spacing w:before="0" w:after="40"/>
+        <w:spacing w:before="0" w:after="20"/>
         <w:ind w:left="288"/>
       </w:pPr>
       <w:r>
@@ -298,7 +298,7 @@
     </w:p>
     <w:p>
       <w:pPr>
-        <w:spacing w:before="0" w:after="40"/>
+        <w:spacing w:before="0" w:after="20"/>
         <w:ind w:left="288"/>
       </w:pPr>
       <w:r>
@@ -313,7 +313,7 @@
     </w:p>
     <w:p>
       <w:pPr>
-        <w:spacing w:before="0" w:after="40"/>
+        <w:spacing w:before="0" w:after="20"/>
         <w:ind w:left="288"/>
       </w:pPr>
       <w:r>
@@ -328,7 +328,7 @@
     </w:p>
     <w:p>
       <w:pPr>
-        <w:spacing w:before="0" w:after="40"/>
+        <w:spacing w:before="0" w:after="20"/>
         <w:ind w:left="288"/>
       </w:pPr>
       <w:r>
@@ -343,7 +343,7 @@
     </w:p>
     <w:p>
       <w:pPr>
-        <w:spacing w:before="0" w:after="40"/>
+        <w:spacing w:before="0" w:after="20"/>
         <w:ind w:left="288"/>
       </w:pPr>
       <w:r>
@@ -358,7 +358,7 @@
     </w:p>
     <w:p>
       <w:pPr>
-        <w:spacing w:before="0" w:after="40"/>
+        <w:spacing w:before="0" w:after="20"/>
         <w:ind w:left="288"/>
       </w:pPr>
       <w:r>
@@ -373,7 +373,7 @@
     </w:p>
     <w:p>
       <w:pPr>
-        <w:spacing w:before="0" w:after="40"/>
+        <w:spacing w:before="0" w:after="20"/>
         <w:ind w:left="288"/>
       </w:pPr>
       <w:r>
@@ -388,7 +388,7 @@
     </w:p>
     <w:p>
       <w:pPr>
-        <w:spacing w:before="0" w:after="40"/>
+        <w:spacing w:before="0" w:after="20"/>
         <w:ind w:left="288"/>
       </w:pPr>
       <w:r>
@@ -403,7 +403,7 @@
     </w:p>
     <w:p>
       <w:pPr>
-        <w:spacing w:before="0" w:after="40"/>
+        <w:spacing w:before="0" w:after="20"/>
         <w:ind w:left="288"/>
       </w:pPr>
       <w:r>
@@ -418,7 +418,7 @@
     </w:p>
     <w:p>
       <w:pPr>
-        <w:spacing w:before="0" w:after="40"/>
+        <w:spacing w:before="0" w:after="20"/>
         <w:ind w:left="288"/>
       </w:pPr>
       <w:r>
@@ -433,7 +433,7 @@
     </w:p>
     <w:p>
       <w:pPr>
-        <w:spacing w:before="0" w:after="40"/>
+        <w:spacing w:before="0" w:after="20"/>
         <w:ind w:left="288"/>
       </w:pPr>
       <w:r>
@@ -448,7 +448,7 @@
     </w:p>
     <w:p>
       <w:pPr>
-        <w:spacing w:before="0" w:after="40"/>
+        <w:spacing w:before="0" w:after="20"/>
         <w:ind w:left="288"/>
       </w:pPr>
       <w:r>
@@ -463,7 +463,7 @@
     </w:p>
     <w:p>
       <w:pPr>
-        <w:spacing w:before="0" w:after="40"/>
+        <w:spacing w:before="0" w:after="20"/>
         <w:ind w:left="288"/>
       </w:pPr>
       <w:r>
@@ -478,7 +478,7 @@
     </w:p>
     <w:p>
       <w:pPr>
-        <w:spacing w:before="0" w:after="40"/>
+        <w:spacing w:before="0" w:after="20"/>
         <w:ind w:left="288"/>
       </w:pPr>
       <w:r>
@@ -493,7 +493,7 @@
     </w:p>
     <w:p>
       <w:pPr>
-        <w:spacing w:before="0" w:after="40"/>
+        <w:spacing w:before="0" w:after="20"/>
         <w:ind w:left="288"/>
       </w:pPr>
       <w:r>
@@ -508,7 +508,7 @@
     </w:p>
     <w:p>
       <w:pPr>
-        <w:spacing w:before="0" w:after="40"/>
+        <w:spacing w:before="0" w:after="20"/>
         <w:ind w:left="288"/>
       </w:pPr>
       <w:r>
@@ -523,7 +523,7 @@
     </w:p>
     <w:p>
       <w:pPr>
-        <w:spacing w:before="0" w:after="40"/>
+        <w:spacing w:before="0" w:after="20"/>
         <w:ind w:left="288"/>
       </w:pPr>
       <w:r>
@@ -538,7 +538,7 @@
     </w:p>
     <w:p>
       <w:pPr>
-        <w:spacing w:before="0" w:after="40"/>
+        <w:spacing w:before="0" w:after="20"/>
         <w:ind w:left="288"/>
       </w:pPr>
       <w:r>
@@ -553,7 +553,7 @@
     </w:p>
     <w:p>
       <w:pPr>
-        <w:spacing w:before="0" w:after="40"/>
+        <w:spacing w:before="0" w:after="20"/>
         <w:ind w:left="288"/>
       </w:pPr>
       <w:r>
@@ -568,7 +568,7 @@
     </w:p>
     <w:p>
       <w:pPr>
-        <w:spacing w:before="0" w:after="40"/>
+        <w:spacing w:before="0" w:after="20"/>
         <w:ind w:left="288"/>
       </w:pPr>
       <w:r>
@@ -583,7 +583,7 @@
     </w:p>
     <w:p>
       <w:pPr>
-        <w:spacing w:before="0" w:after="40"/>
+        <w:spacing w:before="0" w:after="80"/>
       </w:pPr>
       <w:r>
         <w:rPr>
@@ -592,26 +592,12 @@
           <w:i w:val="0"/>
           <w:sz w:val="20"/>
         </w:rPr>
-        <w:t>Soft skills: Leadership (set with tooling, not memos), Strategic thinking (cross-domain: technical, commercial, legal, compliance), Written-first communication (269-entry ADR register as single source of truth), First-principles problem-solving, Decision-making under uncertainty, Adaptability across 9 concurrent projects and multiple stacks, Autonomous self-direction, Evidence over opinion</w:t>
+        <w:t>Soft skills: Leadership (set with tooling, not memos), Strategic thinking (cross-domain: technical, commercial, legal, compliance), Written-first communication (269-entry ADR register as single source of truth), First-principles problem-solving, Decision-making under uncertainty, Adaptability across 9 concurrent projects and multiple stacks, Autonomous self-direction, Evidence over opinion - Hard skills: AI/ML, OpenAI ChatGPT, Anthropic Claude, Google Gemini, DeepSeek R1, Perplexity Sonar, OpenRouter, Cursor, Windsurf, Replit, Claude Code, LLM agent architectures, Prompt engineering, Python, Node.js, PHP, Kotlin / Jetpack Compose, React / Vite, SQL, PostgreSQL, SQLite, ERPNext, Frappe, Stripe, PayPal Billing, AWS (SES, S3 Object Lock, SNS, IAM), Twilio, ElevenLabs, Cloudflare (Workers, KV, R2, D1), DevOps, NixOS, systemd, Playwright, OpenCV, Android / CameraX, MCP, Privacy-preserving architecture</w:t>
       </w:r>
     </w:p>
     <w:p>
       <w:pPr>
-        <w:spacing w:before="0" w:after="40"/>
-      </w:pPr>
-      <w:r>
-        <w:rPr>
-          <w:rFonts w:ascii="Calibri" w:hAnsi="Calibri" w:cs="Calibri"/>
-          <w:b w:val="0"/>
-          <w:i w:val="0"/>
-          <w:sz w:val="20"/>
-        </w:rPr>
-        <w:t>Hard skills: AI/ML, OpenAI ChatGPT, Anthropic Claude, Google Gemini, DeepSeek R1, Perplexity Sonar, OpenRouter, Cursor, Windsurf, Replit, Claude Code, LLM agent architectures, Prompt engineering, Python, Node.js, PHP, Kotlin / Jetpack Compose, React / Vite, SQL, PostgreSQL, SQLite, ERPNext, Frappe, Stripe, PayPal Billing, AWS (SES, S3 Object Lock, SNS, IAM), Twilio, ElevenLabs, Cloudflare (Workers, KV, R2, D1), DevOps, NixOS, systemd, Playwright, OpenCV, Android / CameraX, MCP, Privacy-preserving architecture</w:t>
-      </w:r>
-    </w:p>
-    <w:p>
-      <w:pPr>
-        <w:spacing w:before="160" w:after="40"/>
+        <w:spacing w:before="120" w:after="20"/>
       </w:pPr>
       <w:r>
         <w:rPr>
@@ -667,7 +653,7 @@
     </w:p>
     <w:p>
       <w:pPr>
-        <w:spacing w:before="0" w:after="40"/>
+        <w:spacing w:before="0" w:after="20"/>
         <w:ind w:left="288"/>
       </w:pPr>
       <w:r>
@@ -682,7 +668,7 @@
     </w:p>
     <w:p>
       <w:pPr>
-        <w:spacing w:before="0" w:after="40"/>
+        <w:spacing w:before="0" w:after="20"/>
         <w:ind w:left="288"/>
       </w:pPr>
       <w:r>
@@ -697,7 +683,7 @@
     </w:p>
     <w:p>
       <w:pPr>
-        <w:spacing w:before="0" w:after="40"/>
+        <w:spacing w:before="0" w:after="20"/>
         <w:ind w:left="288"/>
       </w:pPr>
       <w:r>
@@ -712,7 +698,7 @@
     </w:p>
     <w:p>
       <w:pPr>
-        <w:spacing w:before="0" w:after="40"/>
+        <w:spacing w:before="0" w:after="20"/>
         <w:ind w:left="288"/>
       </w:pPr>
       <w:r>
@@ -727,7 +713,7 @@
     </w:p>
     <w:p>
       <w:pPr>
-        <w:spacing w:before="0" w:after="40"/>
+        <w:spacing w:before="0" w:after="20"/>
         <w:ind w:left="288"/>
       </w:pPr>
       <w:r>
@@ -742,7 +728,7 @@
     </w:p>
     <w:p>
       <w:pPr>
-        <w:spacing w:before="0" w:after="40"/>
+        <w:spacing w:before="0" w:after="20"/>
         <w:ind w:left="288"/>
       </w:pPr>
       <w:r>
@@ -757,7 +743,7 @@
     </w:p>
     <w:p>
       <w:pPr>
-        <w:spacing w:before="0" w:after="40"/>
+        <w:spacing w:before="0" w:after="20"/>
         <w:ind w:left="288"/>
       </w:pPr>
       <w:r>
@@ -772,7 +758,7 @@
     </w:p>
     <w:p>
       <w:pPr>
-        <w:spacing w:before="0" w:after="40"/>
+        <w:spacing w:before="0" w:after="80"/>
       </w:pPr>
       <w:r>
         <w:rPr>
@@ -781,26 +767,12 @@
           <w:i w:val="0"/>
           <w:sz w:val="20"/>
         </w:rPr>
-        <w:t>Soft skills: Leadership, Communication, Project scoping and estimation, Problem-solving, Team collaboration, Client relationship management, Strategic thinking, Adaptability, Time management</w:t>
+        <w:t>Soft skills: Leadership, Communication, Project scoping and estimation, Problem-solving, Team collaboration, Client relationship management, Strategic thinking, Adaptability, Time management - Hard skills: Salesforce B2C Commerce Cloud / SFCC / Demandware, Shopify Plus, Headless / composable commerce, Hydrogen + Oxygen, Web performance optimisation, AI/ML technologies, Agile methodology, Pre-sales, Technical documentation, Jira, Confluence</w:t>
       </w:r>
     </w:p>
     <w:p>
       <w:pPr>
-        <w:spacing w:before="0" w:after="40"/>
-      </w:pPr>
-      <w:r>
-        <w:rPr>
-          <w:rFonts w:ascii="Calibri" w:hAnsi="Calibri" w:cs="Calibri"/>
-          <w:b w:val="0"/>
-          <w:i w:val="0"/>
-          <w:sz w:val="20"/>
-        </w:rPr>
-        <w:t>Hard skills: Salesforce B2C Commerce Cloud / SFCC / Demandware, Shopify Plus, Headless / composable commerce, Hydrogen + Oxygen, Web performance optimisation, AI/ML technologies, Agile methodology, Pre-sales, Technical documentation, Jira, Confluence</w:t>
-      </w:r>
-    </w:p>
-    <w:p>
-      <w:pPr>
-        <w:spacing w:before="160" w:after="40"/>
+        <w:spacing w:before="120" w:after="20"/>
       </w:pPr>
       <w:r>
         <w:rPr>
@@ -842,7 +814,7 @@
     </w:p>
     <w:p>
       <w:pPr>
-        <w:spacing w:before="0" w:after="40"/>
+        <w:spacing w:before="0" w:after="20"/>
         <w:ind w:left="288"/>
       </w:pPr>
       <w:r>
@@ -857,7 +829,7 @@
     </w:p>
     <w:p>
       <w:pPr>
-        <w:spacing w:before="0" w:after="40"/>
+        <w:spacing w:before="0" w:after="20"/>
         <w:ind w:left="288"/>
       </w:pPr>
       <w:r>
@@ -872,7 +844,7 @@
     </w:p>
     <w:p>
       <w:pPr>
-        <w:spacing w:before="0" w:after="40"/>
+        <w:spacing w:before="0" w:after="80"/>
       </w:pPr>
       <w:r>
         <w:rPr>
@@ -886,7 +858,7 @@
     </w:p>
     <w:p>
       <w:pPr>
-        <w:spacing w:before="160" w:after="40"/>
+        <w:spacing w:before="120" w:after="20"/>
       </w:pPr>
       <w:r>
         <w:rPr>
@@ -942,7 +914,7 @@
     </w:p>
     <w:p>
       <w:pPr>
-        <w:spacing w:before="0" w:after="40"/>
+        <w:spacing w:before="0" w:after="20"/>
         <w:ind w:left="288"/>
       </w:pPr>
       <w:r>
@@ -957,7 +929,7 @@
     </w:p>
     <w:p>
       <w:pPr>
-        <w:spacing w:before="0" w:after="40"/>
+        <w:spacing w:before="0" w:after="20"/>
         <w:ind w:left="288"/>
       </w:pPr>
       <w:r>
@@ -972,7 +944,7 @@
     </w:p>
     <w:p>
       <w:pPr>
-        <w:spacing w:before="0" w:after="40"/>
+        <w:spacing w:before="0" w:after="20"/>
         <w:ind w:left="288"/>
       </w:pPr>
       <w:r>
@@ -987,7 +959,7 @@
     </w:p>
     <w:p>
       <w:pPr>
-        <w:spacing w:before="0" w:after="40"/>
+        <w:spacing w:before="0" w:after="20"/>
         <w:ind w:left="288"/>
       </w:pPr>
       <w:r>
@@ -1002,7 +974,7 @@
     </w:p>
     <w:p>
       <w:pPr>
-        <w:spacing w:before="0" w:after="40"/>
+        <w:spacing w:before="0" w:after="20"/>
         <w:ind w:left="288"/>
       </w:pPr>
       <w:r>
@@ -1017,7 +989,7 @@
     </w:p>
     <w:p>
       <w:pPr>
-        <w:spacing w:before="0" w:after="40"/>
+        <w:spacing w:before="0" w:after="20"/>
         <w:ind w:left="288"/>
       </w:pPr>
       <w:r>
@@ -1032,7 +1004,7 @@
     </w:p>
     <w:p>
       <w:pPr>
-        <w:spacing w:before="0" w:after="40"/>
+        <w:spacing w:before="0" w:after="20"/>
         <w:ind w:left="288"/>
       </w:pPr>
       <w:r>
@@ -1047,7 +1019,7 @@
     </w:p>
     <w:p>
       <w:pPr>
-        <w:spacing w:before="0" w:after="40"/>
+        <w:spacing w:before="0" w:after="20"/>
         <w:ind w:left="288"/>
       </w:pPr>
       <w:r>
@@ -1062,7 +1034,7 @@
     </w:p>
     <w:p>
       <w:pPr>
-        <w:spacing w:before="0" w:after="40"/>
+        <w:spacing w:before="0" w:after="20"/>
         <w:ind w:left="288"/>
       </w:pPr>
       <w:r>
@@ -1077,7 +1049,7 @@
     </w:p>
     <w:p>
       <w:pPr>
-        <w:spacing w:before="0" w:after="40"/>
+        <w:spacing w:before="0" w:after="80"/>
       </w:pPr>
       <w:r>
         <w:rPr>
@@ -1086,26 +1058,12 @@
           <w:i w:val="0"/>
           <w:sz w:val="20"/>
         </w:rPr>
-        <w:t>Soft skills: Stakeholder management, Cross-cultural relationship management, Data analysis, Project management, Conflict resolution, Time management, Workflow optimisation, Solution architecture, Remote developer management, BI reporting, Mentoring and coaching</w:t>
+        <w:t>Soft skills: Stakeholder management, Cross-cultural relationship management, Data analysis, Project management, Conflict resolution, Time management, Workflow optimisation, Solution architecture, Remote developer management, BI reporting, Mentoring and coaching - Hard skills: SQL Server 2008-2017, Azure, Hyper-V, SSAS, Power BI, Windows Server 2008-2016, SSIS, Microsoft Project, AWS, Active Directory Group Policies, Office 365, SSMSBoost, dbForge, Clustering, Atlassian Jira, Bash Scripting, ApexSQL, PowerShell, Chocolatey, Proxmox, Ceph, CentOS, Windows 10, BPMN 2.0, WordPress, Upwork, Altaro Backup, Odoo, Active Directory, SIP, VOIP, Noble Systems</w:t>
       </w:r>
     </w:p>
     <w:p>
       <w:pPr>
-        <w:spacing w:before="0" w:after="40"/>
-      </w:pPr>
-      <w:r>
-        <w:rPr>
-          <w:rFonts w:ascii="Calibri" w:hAnsi="Calibri" w:cs="Calibri"/>
-          <w:b w:val="0"/>
-          <w:i w:val="0"/>
-          <w:sz w:val="20"/>
-        </w:rPr>
-        <w:t>Hard skills: SQL Server 2008-2017, Azure, Hyper-V, SSAS, Power BI, Windows Server 2008-2016, SSIS, Microsoft Project, AWS, Active Directory Group Policies, Office 365, SSMSBoost, dbForge, Clustering, Atlassian Jira, Bash Scripting, ApexSQL, PowerShell, Chocolatey, Proxmox, Ceph, CentOS, Windows 10, BPMN 2.0, WordPress, Upwork, Altaro Backup, Odoo, Active Directory, SIP, VOIP, Noble Systems</w:t>
-      </w:r>
-    </w:p>
-    <w:p>
-      <w:pPr>
-        <w:spacing w:before="160" w:after="40"/>
+        <w:spacing w:before="120" w:after="20"/>
       </w:pPr>
       <w:r>
         <w:rPr>
@@ -1161,7 +1119,7 @@
     </w:p>
     <w:p>
       <w:pPr>
-        <w:spacing w:before="0" w:after="40"/>
+        <w:spacing w:before="0" w:after="20"/>
         <w:ind w:left="288"/>
       </w:pPr>
       <w:r>
@@ -1176,7 +1134,7 @@
     </w:p>
     <w:p>
       <w:pPr>
-        <w:spacing w:before="0" w:after="40"/>
+        <w:spacing w:before="0" w:after="20"/>
         <w:ind w:left="288"/>
       </w:pPr>
       <w:r>
@@ -1191,7 +1149,7 @@
     </w:p>
     <w:p>
       <w:pPr>
-        <w:spacing w:before="0" w:after="40"/>
+        <w:spacing w:before="0" w:after="20"/>
         <w:ind w:left="288"/>
       </w:pPr>
       <w:r>
@@ -1206,7 +1164,7 @@
     </w:p>
     <w:p>
       <w:pPr>
-        <w:spacing w:before="0" w:after="40"/>
+        <w:spacing w:before="0" w:after="20"/>
         <w:ind w:left="288"/>
       </w:pPr>
       <w:r>
@@ -1221,7 +1179,7 @@
     </w:p>
     <w:p>
       <w:pPr>
-        <w:spacing w:before="0" w:after="40"/>
+        <w:spacing w:before="0" w:after="80"/>
       </w:pPr>
       <w:r>
         <w:rPr>
@@ -1235,7 +1193,7 @@
     </w:p>
     <w:p>
       <w:pPr>
-        <w:spacing w:before="160" w:after="40"/>
+        <w:spacing w:before="120" w:after="20"/>
       </w:pPr>
       <w:r>
         <w:rPr>
@@ -1277,7 +1235,7 @@
     </w:p>
     <w:p>
       <w:pPr>
-        <w:spacing w:before="0" w:after="40"/>
+        <w:spacing w:before="0" w:after="20"/>
         <w:ind w:left="288"/>
       </w:pPr>
       <w:r>
@@ -1292,7 +1250,7 @@
     </w:p>
     <w:p>
       <w:pPr>
-        <w:spacing w:before="160" w:after="40"/>
+        <w:spacing w:before="120" w:after="20"/>
       </w:pPr>
       <w:r>
         <w:rPr>
@@ -1348,7 +1306,7 @@
     </w:p>
     <w:p>
       <w:pPr>
-        <w:spacing w:before="0" w:after="40"/>
+        <w:spacing w:before="0" w:after="20"/>
         <w:ind w:left="288"/>
       </w:pPr>
       <w:r>
@@ -1363,7 +1321,7 @@
     </w:p>
     <w:p>
       <w:pPr>
-        <w:spacing w:before="0" w:after="40"/>
+        <w:spacing w:before="0" w:after="20"/>
         <w:ind w:left="288"/>
       </w:pPr>
       <w:r>
@@ -1378,7 +1336,7 @@
     </w:p>
     <w:p>
       <w:pPr>
-        <w:spacing w:before="0" w:after="40"/>
+        <w:spacing w:before="0" w:after="20"/>
         <w:ind w:left="288"/>
       </w:pPr>
       <w:r>
@@ -1393,7 +1351,7 @@
     </w:p>
     <w:p>
       <w:pPr>
-        <w:spacing w:before="0" w:after="40"/>
+        <w:spacing w:before="0" w:after="20"/>
         <w:ind w:left="288"/>
       </w:pPr>
       <w:r>
@@ -1408,7 +1366,7 @@
     </w:p>
     <w:p>
       <w:pPr>
-        <w:spacing w:before="0" w:after="40"/>
+        <w:spacing w:before="0" w:after="20"/>
         <w:ind w:left="288"/>
       </w:pPr>
       <w:r>
@@ -1423,7 +1381,7 @@
     </w:p>
     <w:p>
       <w:pPr>
-        <w:spacing w:before="0" w:after="40"/>
+        <w:spacing w:before="0" w:after="20"/>
         <w:ind w:left="288"/>
       </w:pPr>
       <w:r>
@@ -1438,7 +1396,7 @@
     </w:p>
     <w:p>
       <w:pPr>
-        <w:spacing w:before="0" w:after="40"/>
+        <w:spacing w:before="0" w:after="20"/>
         <w:ind w:left="288"/>
       </w:pPr>
       <w:r>
@@ -1453,7 +1411,7 @@
     </w:p>
     <w:p>
       <w:pPr>
-        <w:spacing w:before="0" w:after="40"/>
+        <w:spacing w:before="0" w:after="20"/>
         <w:ind w:left="288"/>
       </w:pPr>
       <w:r>
@@ -1468,7 +1426,7 @@
     </w:p>
     <w:p>
       <w:pPr>
-        <w:spacing w:before="0" w:after="40"/>
+        <w:spacing w:before="0" w:after="20"/>
         <w:ind w:left="288"/>
       </w:pPr>
       <w:r>
@@ -1483,7 +1441,7 @@
     </w:p>
     <w:p>
       <w:pPr>
-        <w:spacing w:before="0" w:after="40"/>
+        <w:spacing w:before="0" w:after="20"/>
         <w:ind w:left="288"/>
       </w:pPr>
       <w:r>
@@ -1498,7 +1456,7 @@
     </w:p>
     <w:p>
       <w:pPr>
-        <w:spacing w:before="0" w:after="40"/>
+        <w:spacing w:before="0" w:after="20"/>
         <w:ind w:left="288"/>
       </w:pPr>
       <w:r>
@@ -1513,7 +1471,7 @@
     </w:p>
     <w:p>
       <w:pPr>
-        <w:spacing w:before="0" w:after="40"/>
+        <w:spacing w:before="0" w:after="20"/>
         <w:ind w:left="288"/>
       </w:pPr>
       <w:r>
@@ -1528,7 +1486,7 @@
     </w:p>
     <w:p>
       <w:pPr>
-        <w:spacing w:before="0" w:after="40"/>
+        <w:spacing w:before="0" w:after="20"/>
         <w:ind w:left="288"/>
       </w:pPr>
       <w:r>
@@ -1571,7 +1529,7 @@
     </w:p>
     <w:p>
       <w:pPr>
-        <w:spacing w:before="0" w:after="40"/>
+        <w:spacing w:before="0" w:after="20"/>
         <w:ind w:left="576"/>
       </w:pPr>
       <w:r>
@@ -1586,7 +1544,7 @@
     </w:p>
     <w:p>
       <w:pPr>
-        <w:spacing w:before="0" w:after="40"/>
+        <w:spacing w:before="0" w:after="20"/>
         <w:ind w:left="576"/>
       </w:pPr>
       <w:r>
@@ -1601,7 +1559,7 @@
     </w:p>
     <w:p>
       <w:pPr>
-        <w:spacing w:before="0" w:after="40"/>
+        <w:spacing w:before="0" w:after="20"/>
         <w:ind w:left="576"/>
       </w:pPr>
       <w:r>
@@ -1616,7 +1574,7 @@
     </w:p>
     <w:p>
       <w:pPr>
-        <w:spacing w:before="0" w:after="40"/>
+        <w:spacing w:before="0" w:after="20"/>
         <w:ind w:left="576"/>
       </w:pPr>
       <w:r>
@@ -1659,7 +1617,7 @@
     </w:p>
     <w:p>
       <w:pPr>
-        <w:spacing w:before="0" w:after="40"/>
+        <w:spacing w:before="0" w:after="20"/>
         <w:ind w:left="576"/>
       </w:pPr>
       <w:r>
@@ -1674,7 +1632,7 @@
     </w:p>
     <w:p>
       <w:pPr>
-        <w:spacing w:before="0" w:after="40"/>
+        <w:spacing w:before="0" w:after="20"/>
         <w:ind w:left="576"/>
       </w:pPr>
       <w:r>
@@ -1689,7 +1647,7 @@
     </w:p>
     <w:p>
       <w:pPr>
-        <w:spacing w:before="0" w:after="40"/>
+        <w:spacing w:before="0" w:after="20"/>
         <w:ind w:left="576"/>
       </w:pPr>
       <w:r>
@@ -1704,7 +1662,7 @@
     </w:p>
     <w:p>
       <w:pPr>
-        <w:spacing w:before="0" w:after="40"/>
+        <w:spacing w:before="0" w:after="20"/>
         <w:ind w:left="576"/>
       </w:pPr>
       <w:r>
@@ -1747,7 +1705,7 @@
     </w:p>
     <w:p>
       <w:pPr>
-        <w:spacing w:before="0" w:after="40"/>
+        <w:spacing w:before="0" w:after="20"/>
         <w:ind w:left="576"/>
       </w:pPr>
       <w:r>
@@ -1762,7 +1720,7 @@
     </w:p>
     <w:p>
       <w:pPr>
-        <w:spacing w:before="0" w:after="40"/>
+        <w:spacing w:before="0" w:after="20"/>
         <w:ind w:left="576"/>
       </w:pPr>
       <w:r>
@@ -1777,7 +1735,7 @@
     </w:p>
     <w:p>
       <w:pPr>
-        <w:spacing w:before="0" w:after="40"/>
+        <w:spacing w:before="0" w:after="20"/>
         <w:ind w:left="576"/>
       </w:pPr>
       <w:r>
@@ -1820,7 +1778,7 @@
     </w:p>
     <w:p>
       <w:pPr>
-        <w:spacing w:before="0" w:after="40"/>
+        <w:spacing w:before="0" w:after="20"/>
         <w:ind w:left="576"/>
       </w:pPr>
       <w:r>
@@ -1835,7 +1793,7 @@
     </w:p>
     <w:p>
       <w:pPr>
-        <w:spacing w:before="0" w:after="40"/>
+        <w:spacing w:before="0" w:after="20"/>
         <w:ind w:left="576"/>
       </w:pPr>
       <w:r>
@@ -1850,7 +1808,7 @@
     </w:p>
     <w:p>
       <w:pPr>
-        <w:spacing w:before="0" w:after="40"/>
+        <w:spacing w:before="0" w:after="80"/>
       </w:pPr>
       <w:r>
         <w:rPr>
@@ -1859,26 +1817,12 @@
           <w:i w:val="0"/>
           <w:sz w:val="20"/>
         </w:rPr>
-        <w:t>Soft skills: Sales, Marketing, Data analysis, Solution architecture, Team building, Six Sigma, Project management, Recruitment, Process documentation, Business analysis, Workflow redesign, Remote developer management, BI reporting, Business networking, Contract negotiation, Process improvement, Branding, Design sense, Coaching</w:t>
+        <w:t>Soft skills: Sales, Marketing, Data analysis, Solution architecture, Team building, Six Sigma, Project management, Recruitment, Process documentation, Business analysis, Workflow redesign, Remote developer management, BI reporting, Business networking, Contract negotiation, Process improvement, Branding, Design sense, Coaching - Hard skills: PHP, JavaScript, HTML5, CSS3, AJAX, jQuery, WordPress, SQL Server, NodeJS, Angular 2, SASS, C# .NET, Linq, SOAP, Web Services, JIRA, Responsive Web Design, React.js, Amazon Web Services (EC2, SES, RDS, S3, Elastic Beanstalk, CloudFront, CloudWatch), CloudFlare, Incapsula, MailChimp, Zoho, Node.js, ExpressJS, Mocha, Chai, Heroku, Travis CI</w:t>
       </w:r>
     </w:p>
     <w:p>
       <w:pPr>
-        <w:spacing w:before="0" w:after="40"/>
-      </w:pPr>
-      <w:r>
-        <w:rPr>
-          <w:rFonts w:ascii="Calibri" w:hAnsi="Calibri" w:cs="Calibri"/>
-          <w:b w:val="0"/>
-          <w:i w:val="0"/>
-          <w:sz w:val="20"/>
-        </w:rPr>
-        <w:t>Hard skills: PHP, JavaScript, HTML5, CSS3, AJAX, jQuery, WordPress, SQL Server, NodeJS, Angular 2, SASS, C# .NET, Linq, SOAP, Web Services, JIRA, Responsive Web Design, React.js, Amazon Web Services (EC2, SES, RDS, S3, Elastic Beanstalk, CloudFront, CloudWatch), CloudFlare, Incapsula, MailChimp, Zoho, Node.js, ExpressJS, Mocha, Chai, Heroku, Travis CI</w:t>
-      </w:r>
-    </w:p>
-    <w:p>
-      <w:pPr>
-        <w:spacing w:before="160" w:after="40"/>
+        <w:spacing w:before="120" w:after="20"/>
       </w:pPr>
       <w:r>
         <w:rPr>
@@ -1920,7 +1864,7 @@
     </w:p>
     <w:p>
       <w:pPr>
-        <w:spacing w:before="0" w:after="40"/>
+        <w:spacing w:before="0" w:after="20"/>
         <w:ind w:left="288"/>
       </w:pPr>
       <w:r>
@@ -1935,7 +1879,7 @@
     </w:p>
     <w:p>
       <w:pPr>
-        <w:spacing w:before="0" w:after="40"/>
+        <w:spacing w:before="0" w:after="20"/>
         <w:ind w:left="288"/>
       </w:pPr>
       <w:r>
@@ -1950,7 +1894,7 @@
     </w:p>
     <w:p>
       <w:pPr>
-        <w:spacing w:before="0" w:after="40"/>
+        <w:spacing w:before="0" w:after="20"/>
         <w:ind w:left="288"/>
       </w:pPr>
       <w:r>
@@ -1965,7 +1909,7 @@
     </w:p>
     <w:p>
       <w:pPr>
-        <w:spacing w:before="0" w:after="40"/>
+        <w:spacing w:before="0" w:after="20"/>
         <w:ind w:left="288"/>
       </w:pPr>
       <w:r>
@@ -1980,7 +1924,7 @@
     </w:p>
     <w:p>
       <w:pPr>
-        <w:spacing w:before="0" w:after="40"/>
+        <w:spacing w:before="0" w:after="20"/>
         <w:ind w:left="288"/>
       </w:pPr>
       <w:r>
@@ -1995,7 +1939,7 @@
     </w:p>
     <w:p>
       <w:pPr>
-        <w:spacing w:before="0" w:after="40"/>
+        <w:spacing w:before="0" w:after="20"/>
         <w:ind w:left="288"/>
       </w:pPr>
       <w:r>
@@ -2010,7 +1954,7 @@
     </w:p>
     <w:p>
       <w:pPr>
-        <w:spacing w:before="0" w:after="40"/>
+        <w:spacing w:before="0" w:after="20"/>
         <w:ind w:left="288"/>
       </w:pPr>
       <w:r>
@@ -2025,7 +1969,7 @@
     </w:p>
     <w:p>
       <w:pPr>
-        <w:spacing w:before="0" w:after="40"/>
+        <w:spacing w:before="0" w:after="20"/>
         <w:ind w:left="288"/>
       </w:pPr>
       <w:r>
@@ -2040,7 +1984,7 @@
     </w:p>
     <w:p>
       <w:pPr>
-        <w:spacing w:before="0" w:after="40"/>
+        <w:spacing w:before="0" w:after="80"/>
       </w:pPr>
       <w:r>
         <w:rPr>
@@ -2049,40 +1993,12 @@
           <w:i w:val="0"/>
           <w:sz w:val="20"/>
         </w:rPr>
-        <w:t>Soft skills: Project management, Mentoring, Quality control, Business process improvement, Management reporting, Conflict resolution, Stakeholder management, Solution architecture, Software design patterns, Remote developer management, Coaching</w:t>
+        <w:t>Soft skills: Project management, Mentoring, Quality control, Business process improvement, Management reporting, Conflict resolution, Stakeholder management, Solution architecture, Software design patterns, Remote developer management, Coaching - Hard skills: SQL Server, SSIS, T-SQL, C# .NET, MVC pattern, Winforms, ETL, BI, SSAS, MS Access/Word/Excel VBA, VSTO, NUnit, ReSharper, Visual Studio, SharePoint, Agile/Scrum, SOAP, Web Services, JIRA, Confluence, RESTful APIs, UML, XPath, Subversion, Tortoise SVN, SourceSafe, WhereScape RED, Tableau, TFS, Rally - Agile: Daily Standups, Kanban, Rally, Iterations, Backlog Grooming, Planning Poker (T-Shirt Sizes), Given-When-Then (Cucumber), BDD, Mocking Frameworks, Unit Testing, Usability Testing, CI, Continuous Delivery, Refactoring, Spikes, Velocity Tuning, Definition of Done, Paired Programming, User Stories, Story Splitting, Timeboxing, Heartbeat Retrospectives, Burndown Charts</w:t>
       </w:r>
     </w:p>
     <w:p>
       <w:pPr>
-        <w:spacing w:before="0" w:after="40"/>
-      </w:pPr>
-      <w:r>
-        <w:rPr>
-          <w:rFonts w:ascii="Calibri" w:hAnsi="Calibri" w:cs="Calibri"/>
-          <w:b w:val="0"/>
-          <w:i w:val="0"/>
-          <w:sz w:val="20"/>
-        </w:rPr>
-        <w:t>Hard skills: SQL Server, SSIS, T-SQL, C# .NET, MVC pattern, Winforms, ETL, BI, SSAS, MS Access/Word/Excel VBA, VSTO, NUnit, ReSharper, Visual Studio, SharePoint, Agile/Scrum, SOAP, Web Services, JIRA, Confluence, RESTful APIs, UML, XPath, Subversion, Tortoise SVN, SourceSafe, WhereScape RED, Tableau, TFS, Rally</w:t>
-      </w:r>
-    </w:p>
-    <w:p>
-      <w:pPr>
-        <w:spacing w:before="0" w:after="40"/>
-      </w:pPr>
-      <w:r>
-        <w:rPr>
-          <w:rFonts w:ascii="Calibri" w:hAnsi="Calibri" w:cs="Calibri"/>
-          <w:b w:val="0"/>
-          <w:i w:val="0"/>
-          <w:sz w:val="20"/>
-        </w:rPr>
-        <w:t>Agile practices: Daily Standups, Kanban, Rally, Iterations, Backlog Grooming, Planning Poker (T-Shirt Sizes), Given-When-Then (Cucumber), BDD, Mocking Frameworks, Unit Testing, Usability Testing, CI, Continuous Delivery, Refactoring, Spikes, Velocity Tuning, Definition of Done, Paired Programming, User Stories, Story Splitting, Timeboxing, Heartbeat Retrospectives, Burndown Charts</w:t>
-      </w:r>
-    </w:p>
-    <w:p>
-      <w:pPr>
-        <w:spacing w:before="160" w:after="40"/>
+        <w:spacing w:before="120" w:after="20"/>
       </w:pPr>
       <w:r>
         <w:rPr>
@@ -2152,7 +2068,7 @@
     </w:p>
     <w:p>
       <w:pPr>
-        <w:spacing w:before="0" w:after="40"/>
+        <w:spacing w:before="0" w:after="20"/>
         <w:ind w:left="576"/>
       </w:pPr>
       <w:r>
@@ -2167,7 +2083,7 @@
     </w:p>
     <w:p>
       <w:pPr>
-        <w:spacing w:before="0" w:after="40"/>
+        <w:spacing w:before="0" w:after="20"/>
         <w:ind w:left="576"/>
       </w:pPr>
       <w:r>
@@ -2182,7 +2098,7 @@
     </w:p>
     <w:p>
       <w:pPr>
-        <w:spacing w:before="0" w:after="40"/>
+        <w:spacing w:before="0" w:after="20"/>
         <w:ind w:left="576"/>
       </w:pPr>
       <w:r>
@@ -2197,7 +2113,7 @@
     </w:p>
     <w:p>
       <w:pPr>
-        <w:spacing w:before="0" w:after="40"/>
+        <w:spacing w:before="0" w:after="20"/>
         <w:ind w:left="576"/>
       </w:pPr>
       <w:r>
@@ -2240,7 +2156,7 @@
     </w:p>
     <w:p>
       <w:pPr>
-        <w:spacing w:before="0" w:after="40"/>
+        <w:spacing w:before="0" w:after="20"/>
         <w:ind w:left="576"/>
       </w:pPr>
       <w:r>
@@ -2255,7 +2171,7 @@
     </w:p>
     <w:p>
       <w:pPr>
-        <w:spacing w:before="0" w:after="40"/>
+        <w:spacing w:before="0" w:after="20"/>
         <w:ind w:left="576"/>
       </w:pPr>
       <w:r>
@@ -2298,7 +2214,7 @@
     </w:p>
     <w:p>
       <w:pPr>
-        <w:spacing w:before="0" w:after="40"/>
+        <w:spacing w:before="0" w:after="20"/>
         <w:ind w:left="576"/>
       </w:pPr>
       <w:r>
@@ -2341,7 +2257,7 @@
     </w:p>
     <w:p>
       <w:pPr>
-        <w:spacing w:before="0" w:after="40"/>
+        <w:spacing w:before="0" w:after="20"/>
         <w:ind w:left="576"/>
       </w:pPr>
       <w:r>
@@ -2356,7 +2272,7 @@
     </w:p>
     <w:p>
       <w:pPr>
-        <w:spacing w:before="0" w:after="40"/>
+        <w:spacing w:before="0" w:after="20"/>
         <w:ind w:left="576"/>
       </w:pPr>
       <w:r>
@@ -2371,7 +2287,7 @@
     </w:p>
     <w:p>
       <w:pPr>
-        <w:spacing w:before="0" w:after="40"/>
+        <w:spacing w:before="0" w:after="20"/>
         <w:ind w:left="576"/>
       </w:pPr>
       <w:r>
@@ -2386,7 +2302,7 @@
     </w:p>
     <w:p>
       <w:pPr>
-        <w:spacing w:before="0" w:after="40"/>
+        <w:spacing w:before="0" w:after="20"/>
         <w:ind w:left="576"/>
       </w:pPr>
       <w:r>
@@ -2401,7 +2317,7 @@
     </w:p>
     <w:p>
       <w:pPr>
-        <w:spacing w:before="0" w:after="40"/>
+        <w:spacing w:before="0" w:after="20"/>
         <w:ind w:left="576"/>
       </w:pPr>
       <w:r>
@@ -2444,7 +2360,7 @@
     </w:p>
     <w:p>
       <w:pPr>
-        <w:spacing w:before="0" w:after="40"/>
+        <w:spacing w:before="0" w:after="20"/>
         <w:ind w:left="576"/>
       </w:pPr>
       <w:r>
@@ -2459,7 +2375,7 @@
     </w:p>
     <w:p>
       <w:pPr>
-        <w:spacing w:before="0" w:after="40"/>
+        <w:spacing w:before="0" w:after="20"/>
         <w:ind w:left="576"/>
       </w:pPr>
       <w:r>
@@ -2502,7 +2418,7 @@
     </w:p>
     <w:p>
       <w:pPr>
-        <w:spacing w:before="0" w:after="40"/>
+        <w:spacing w:before="0" w:after="20"/>
         <w:ind w:left="576"/>
       </w:pPr>
       <w:r>
@@ -2517,7 +2433,7 @@
     </w:p>
     <w:p>
       <w:pPr>
-        <w:spacing w:before="0" w:after="40"/>
+        <w:spacing w:before="0" w:after="80"/>
       </w:pPr>
       <w:r>
         <w:rPr>
@@ -2531,7 +2447,7 @@
     </w:p>
     <w:p>
       <w:pPr>
-        <w:spacing w:before="240" w:after="120"/>
+        <w:spacing w:before="160" w:after="60"/>
       </w:pPr>
       <w:r>
         <w:rPr>
@@ -2545,7 +2461,7 @@
     </w:p>
     <w:p>
       <w:pPr>
-        <w:spacing w:before="0" w:after="40"/>
+        <w:spacing w:before="0" w:after="20"/>
         <w:ind w:left="288"/>
       </w:pPr>
       <w:r>
@@ -2560,7 +2476,7 @@
     </w:p>
     <w:p>
       <w:pPr>
-        <w:spacing w:before="0" w:after="40"/>
+        <w:spacing w:before="0" w:after="20"/>
         <w:ind w:left="288"/>
       </w:pPr>
       <w:r>
@@ -2575,7 +2491,7 @@
     </w:p>
     <w:p>
       <w:pPr>
-        <w:spacing w:before="0" w:after="40"/>
+        <w:spacing w:before="0" w:after="20"/>
         <w:ind w:left="288"/>
       </w:pPr>
       <w:r>
@@ -2590,7 +2506,7 @@
     </w:p>
     <w:p>
       <w:pPr>
-        <w:spacing w:before="0" w:after="40"/>
+        <w:spacing w:before="0" w:after="20"/>
         <w:ind w:left="288"/>
       </w:pPr>
       <w:r>
@@ -2605,7 +2521,7 @@
     </w:p>
     <w:p>
       <w:pPr>
-        <w:spacing w:before="0" w:after="40"/>
+        <w:spacing w:before="0" w:after="20"/>
         <w:ind w:left="288"/>
       </w:pPr>
       <w:r>
@@ -2620,7 +2536,7 @@
     </w:p>
     <w:p>
       <w:pPr>
-        <w:spacing w:before="240" w:after="120"/>
+        <w:spacing w:before="160" w:after="60"/>
       </w:pPr>
       <w:r>
         <w:rPr>
@@ -2634,7 +2550,7 @@
     </w:p>
     <w:p>
       <w:pPr>
-        <w:spacing w:before="0" w:after="40"/>
+        <w:spacing w:before="0" w:after="20"/>
         <w:ind w:left="288"/>
       </w:pPr>
       <w:r>
@@ -2649,7 +2565,7 @@
     </w:p>
     <w:p>
       <w:pPr>
-        <w:spacing w:before="0" w:after="40"/>
+        <w:spacing w:before="0" w:after="20"/>
         <w:ind w:left="288"/>
       </w:pPr>
       <w:r>
@@ -2664,7 +2580,7 @@
     </w:p>
     <w:p>
       <w:pPr>
-        <w:spacing w:before="240" w:after="120"/>
+        <w:spacing w:before="160" w:after="60"/>
       </w:pPr>
       <w:r>
         <w:rPr>
@@ -2678,532 +2594,21 @@
     </w:p>
     <w:p>
       <w:pPr>
-        <w:spacing w:before="0" w:after="40"/>
-        <w:ind w:left="288"/>
+        <w:spacing w:before="0" w:after="80"/>
       </w:pPr>
       <w:r>
         <w:rPr>
           <w:rFonts w:ascii="Calibri" w:hAnsi="Calibri" w:cs="Calibri"/>
           <w:b w:val="0"/>
           <w:i w:val="0"/>
-          <w:sz w:val="22"/>
+          <w:sz w:val="20"/>
         </w:rPr>
-        <w:t>* Scaled Agile Framework (SAFe) - Udemy - Studying</w:t>
+        <w:t>Scaled Agile Framework (SAFe) (Udemy Studying) - Six Sigma Green Belt (ExpertRating Studying) - Mental Health Care (HammondCare 2025) - Zumba Instructor (Zumba International 2024) - Wu-Tang Certified DJ (Wu-Tang Clan 2022) - CPR and First Aid (State Emergency Services 2020) - ITIL v3 Foundation (PeopleCert 2020) - Understanding Privilege, Power and Diversity (The Mankind Project 2019) - Outreach Facilitator (Syzygy Dance Project 2018) - Advanced Leadership (Robert Kirby International 2016) - TOGAF 9.1 Accelerated Enterprise Architect (Udemy 2016) - Body Psychotherapy (Robert Kirby International 2016) - Certified Customer Value Optimisation Specialist (Digital Marketer 2015) - Google Analytics Certification (Google Partners 2015) - Google AdWords Certification (Google Partners 2015) - Conversion Funnel Mastery (Digital Marketer 2015) - Heart Centred Leadership (Robert Kirby International 2015) - Inspire to Buy (Authentic Education 2015) - Difference-Maker Accelerator (Authentic Education 2015) - Certificate IV Small Business Management (SETS 2014) - Microsoft Certified Professional (SQL Server 2012) (Microsoft 2013) - Leading Events and Workshops (Robert Kirby International 2013) - Presenting with Passion (Robert Kirby International 2013) - Results Coaching (Robert Kirby International 2013) - LinkedIn Sales Intensive (Rebel Entrepreneurs 2012) - Present Like a Pro (Authentic Education 2012) - Selling with Integrity (Authentic Education 2012) - Expert Accelerator (Authentic Education 2012) - Certified ScrumMaster (Scrum Alliance 2011) - WhereScape RED Developer (MIP 2011) - Audio Visual (AV) Technician (Thrive Community Church 2010) - Think On Your Feet (Impromptu Speaking) (TOYF International 2010) - Microsoft Certified Professional (SSAS) (Dimension Data 2009) - Financial Services Authority Unit 3 Credit Derivatives (BPP 2006) - Microsoft Certified Application Developer (MCAD) (Microsoft 2003)</w:t>
       </w:r>
     </w:p>
     <w:p>
       <w:pPr>
-        <w:spacing w:before="0" w:after="40"/>
-        <w:ind w:left="288"/>
-      </w:pPr>
-      <w:r>
-        <w:rPr>
-          <w:rFonts w:ascii="Calibri" w:hAnsi="Calibri" w:cs="Calibri"/>
-          <w:b w:val="0"/>
-          <w:i w:val="0"/>
-          <w:sz w:val="22"/>
-        </w:rPr>
-        <w:t>* Six Sigma Green Belt - ExpertRating - Studying</w:t>
-      </w:r>
-    </w:p>
-    <w:p>
-      <w:pPr>
-        <w:spacing w:before="0" w:after="40"/>
-        <w:ind w:left="288"/>
-      </w:pPr>
-      <w:r>
-        <w:rPr>
-          <w:rFonts w:ascii="Calibri" w:hAnsi="Calibri" w:cs="Calibri"/>
-          <w:b w:val="0"/>
-          <w:i w:val="0"/>
-          <w:sz w:val="22"/>
-        </w:rPr>
-        <w:t>* Mental Health Care - HammondCare - 2025</w:t>
-      </w:r>
-    </w:p>
-    <w:p>
-      <w:pPr>
-        <w:spacing w:before="0" w:after="40"/>
-        <w:ind w:left="288"/>
-      </w:pPr>
-      <w:r>
-        <w:rPr>
-          <w:rFonts w:ascii="Calibri" w:hAnsi="Calibri" w:cs="Calibri"/>
-          <w:b w:val="0"/>
-          <w:i w:val="0"/>
-          <w:sz w:val="22"/>
-        </w:rPr>
-        <w:t>* Zumba Instructor - Zumba International - 2024</w:t>
-      </w:r>
-    </w:p>
-    <w:p>
-      <w:pPr>
-        <w:spacing w:before="0" w:after="40"/>
-        <w:ind w:left="288"/>
-      </w:pPr>
-      <w:r>
-        <w:rPr>
-          <w:rFonts w:ascii="Calibri" w:hAnsi="Calibri" w:cs="Calibri"/>
-          <w:b w:val="0"/>
-          <w:i w:val="0"/>
-          <w:sz w:val="22"/>
-        </w:rPr>
-        <w:t>* Wu-Tang Certified DJ - Wu-Tang Clan - 2022</w:t>
-      </w:r>
-    </w:p>
-    <w:p>
-      <w:pPr>
-        <w:spacing w:before="0" w:after="40"/>
-        <w:ind w:left="288"/>
-      </w:pPr>
-      <w:r>
-        <w:rPr>
-          <w:rFonts w:ascii="Calibri" w:hAnsi="Calibri" w:cs="Calibri"/>
-          <w:b w:val="0"/>
-          <w:i w:val="0"/>
-          <w:sz w:val="22"/>
-        </w:rPr>
-        <w:t>* CPR and First Aid - State Emergency Services - 2020</w:t>
-      </w:r>
-    </w:p>
-    <w:p>
-      <w:pPr>
-        <w:spacing w:before="0" w:after="40"/>
-        <w:ind w:left="288"/>
-      </w:pPr>
-      <w:r>
-        <w:rPr>
-          <w:rFonts w:ascii="Calibri" w:hAnsi="Calibri" w:cs="Calibri"/>
-          <w:b w:val="0"/>
-          <w:i w:val="0"/>
-          <w:sz w:val="22"/>
-        </w:rPr>
-        <w:t>* ITIL v3 Foundation - PeopleCert - 2020</w:t>
-      </w:r>
-    </w:p>
-    <w:p>
-      <w:pPr>
-        <w:spacing w:before="0" w:after="40"/>
-        <w:ind w:left="288"/>
-      </w:pPr>
-      <w:r>
-        <w:rPr>
-          <w:rFonts w:ascii="Calibri" w:hAnsi="Calibri" w:cs="Calibri"/>
-          <w:b w:val="0"/>
-          <w:i w:val="0"/>
-          <w:sz w:val="22"/>
-        </w:rPr>
-        <w:t>* Understanding Privilege, Power and Diversity - The Mankind Project - 2019</w:t>
-      </w:r>
-    </w:p>
-    <w:p>
-      <w:pPr>
-        <w:spacing w:before="0" w:after="40"/>
-        <w:ind w:left="288"/>
-      </w:pPr>
-      <w:r>
-        <w:rPr>
-          <w:rFonts w:ascii="Calibri" w:hAnsi="Calibri" w:cs="Calibri"/>
-          <w:b w:val="0"/>
-          <w:i w:val="0"/>
-          <w:sz w:val="22"/>
-        </w:rPr>
-        <w:t>* Outreach Facilitator - Syzygy Dance Project - 2018</w:t>
-      </w:r>
-    </w:p>
-    <w:p>
-      <w:pPr>
-        <w:spacing w:before="0" w:after="40"/>
-        <w:ind w:left="288"/>
-      </w:pPr>
-      <w:r>
-        <w:rPr>
-          <w:rFonts w:ascii="Calibri" w:hAnsi="Calibri" w:cs="Calibri"/>
-          <w:b w:val="0"/>
-          <w:i w:val="0"/>
-          <w:sz w:val="22"/>
-        </w:rPr>
-        <w:t>* Advanced Leadership - Robert Kirby International - 2016</w:t>
-      </w:r>
-    </w:p>
-    <w:p>
-      <w:pPr>
-        <w:spacing w:before="0" w:after="40"/>
-        <w:ind w:left="288"/>
-      </w:pPr>
-      <w:r>
-        <w:rPr>
-          <w:rFonts w:ascii="Calibri" w:hAnsi="Calibri" w:cs="Calibri"/>
-          <w:b w:val="0"/>
-          <w:i w:val="0"/>
-          <w:sz w:val="22"/>
-        </w:rPr>
-        <w:t>* TOGAF 9.1 Accelerated Enterprise Architect - Udemy - 2016</w:t>
-      </w:r>
-    </w:p>
-    <w:p>
-      <w:pPr>
-        <w:spacing w:before="0" w:after="40"/>
-        <w:ind w:left="288"/>
-      </w:pPr>
-      <w:r>
-        <w:rPr>
-          <w:rFonts w:ascii="Calibri" w:hAnsi="Calibri" w:cs="Calibri"/>
-          <w:b w:val="0"/>
-          <w:i w:val="0"/>
-          <w:sz w:val="22"/>
-        </w:rPr>
-        <w:t>* Body Psychotherapy - Robert Kirby International - 2016</w:t>
-      </w:r>
-    </w:p>
-    <w:p>
-      <w:pPr>
-        <w:spacing w:before="0" w:after="40"/>
-        <w:ind w:left="288"/>
-      </w:pPr>
-      <w:r>
-        <w:rPr>
-          <w:rFonts w:ascii="Calibri" w:hAnsi="Calibri" w:cs="Calibri"/>
-          <w:b w:val="0"/>
-          <w:i w:val="0"/>
-          <w:sz w:val="22"/>
-        </w:rPr>
-        <w:t>* Certified Customer Value Optimisation Specialist - Digital Marketer - 2015</w:t>
-      </w:r>
-    </w:p>
-    <w:p>
-      <w:pPr>
-        <w:spacing w:before="0" w:after="40"/>
-        <w:ind w:left="288"/>
-      </w:pPr>
-      <w:r>
-        <w:rPr>
-          <w:rFonts w:ascii="Calibri" w:hAnsi="Calibri" w:cs="Calibri"/>
-          <w:b w:val="0"/>
-          <w:i w:val="0"/>
-          <w:sz w:val="22"/>
-        </w:rPr>
-        <w:t>* Google Analytics Certification - Google Partners - 2015</w:t>
-      </w:r>
-    </w:p>
-    <w:p>
-      <w:pPr>
-        <w:spacing w:before="0" w:after="40"/>
-        <w:ind w:left="288"/>
-      </w:pPr>
-      <w:r>
-        <w:rPr>
-          <w:rFonts w:ascii="Calibri" w:hAnsi="Calibri" w:cs="Calibri"/>
-          <w:b w:val="0"/>
-          <w:i w:val="0"/>
-          <w:sz w:val="22"/>
-        </w:rPr>
-        <w:t>* Google AdWords Certification - Google Partners - 2015</w:t>
-      </w:r>
-    </w:p>
-    <w:p>
-      <w:pPr>
-        <w:spacing w:before="0" w:after="40"/>
-        <w:ind w:left="288"/>
-      </w:pPr>
-      <w:r>
-        <w:rPr>
-          <w:rFonts w:ascii="Calibri" w:hAnsi="Calibri" w:cs="Calibri"/>
-          <w:b w:val="0"/>
-          <w:i w:val="0"/>
-          <w:sz w:val="22"/>
-        </w:rPr>
-        <w:t>* Conversion Funnel Mastery - Digital Marketer - 2015</w:t>
-      </w:r>
-    </w:p>
-    <w:p>
-      <w:pPr>
-        <w:spacing w:before="0" w:after="40"/>
-        <w:ind w:left="288"/>
-      </w:pPr>
-      <w:r>
-        <w:rPr>
-          <w:rFonts w:ascii="Calibri" w:hAnsi="Calibri" w:cs="Calibri"/>
-          <w:b w:val="0"/>
-          <w:i w:val="0"/>
-          <w:sz w:val="22"/>
-        </w:rPr>
-        <w:t>* Heart Centred Leadership - Robert Kirby International - 2015</w:t>
-      </w:r>
-    </w:p>
-    <w:p>
-      <w:pPr>
-        <w:spacing w:before="0" w:after="40"/>
-        <w:ind w:left="288"/>
-      </w:pPr>
-      <w:r>
-        <w:rPr>
-          <w:rFonts w:ascii="Calibri" w:hAnsi="Calibri" w:cs="Calibri"/>
-          <w:b w:val="0"/>
-          <w:i w:val="0"/>
-          <w:sz w:val="22"/>
-        </w:rPr>
-        <w:t>* Inspire to Buy - Authentic Education - 2015</w:t>
-      </w:r>
-    </w:p>
-    <w:p>
-      <w:pPr>
-        <w:spacing w:before="0" w:after="40"/>
-        <w:ind w:left="288"/>
-      </w:pPr>
-      <w:r>
-        <w:rPr>
-          <w:rFonts w:ascii="Calibri" w:hAnsi="Calibri" w:cs="Calibri"/>
-          <w:b w:val="0"/>
-          <w:i w:val="0"/>
-          <w:sz w:val="22"/>
-        </w:rPr>
-        <w:t>* Difference-Maker Accelerator - Authentic Education - 2015</w:t>
-      </w:r>
-    </w:p>
-    <w:p>
-      <w:pPr>
-        <w:spacing w:before="0" w:after="40"/>
-        <w:ind w:left="288"/>
-      </w:pPr>
-      <w:r>
-        <w:rPr>
-          <w:rFonts w:ascii="Calibri" w:hAnsi="Calibri" w:cs="Calibri"/>
-          <w:b w:val="0"/>
-          <w:i w:val="0"/>
-          <w:sz w:val="22"/>
-        </w:rPr>
-        <w:t>* Certificate IV Small Business Management - SETS - 2014</w:t>
-      </w:r>
-    </w:p>
-    <w:p>
-      <w:pPr>
-        <w:spacing w:before="0" w:after="40"/>
-        <w:ind w:left="288"/>
-      </w:pPr>
-      <w:r>
-        <w:rPr>
-          <w:rFonts w:ascii="Calibri" w:hAnsi="Calibri" w:cs="Calibri"/>
-          <w:b w:val="0"/>
-          <w:i w:val="0"/>
-          <w:sz w:val="22"/>
-        </w:rPr>
-        <w:t>* Microsoft Certified Professional (SQL Server 2012) - Microsoft - 2013</w:t>
-      </w:r>
-    </w:p>
-    <w:p>
-      <w:pPr>
-        <w:spacing w:before="0" w:after="40"/>
-        <w:ind w:left="288"/>
-      </w:pPr>
-      <w:r>
-        <w:rPr>
-          <w:rFonts w:ascii="Calibri" w:hAnsi="Calibri" w:cs="Calibri"/>
-          <w:b w:val="0"/>
-          <w:i w:val="0"/>
-          <w:sz w:val="22"/>
-        </w:rPr>
-        <w:t>* Leading Events and Workshops - Robert Kirby International - 2013</w:t>
-      </w:r>
-    </w:p>
-    <w:p>
-      <w:pPr>
-        <w:spacing w:before="0" w:after="40"/>
-        <w:ind w:left="288"/>
-      </w:pPr>
-      <w:r>
-        <w:rPr>
-          <w:rFonts w:ascii="Calibri" w:hAnsi="Calibri" w:cs="Calibri"/>
-          <w:b w:val="0"/>
-          <w:i w:val="0"/>
-          <w:sz w:val="22"/>
-        </w:rPr>
-        <w:t>* Presenting with Passion - Robert Kirby International - 2013</w:t>
-      </w:r>
-    </w:p>
-    <w:p>
-      <w:pPr>
-        <w:spacing w:before="0" w:after="40"/>
-        <w:ind w:left="288"/>
-      </w:pPr>
-      <w:r>
-        <w:rPr>
-          <w:rFonts w:ascii="Calibri" w:hAnsi="Calibri" w:cs="Calibri"/>
-          <w:b w:val="0"/>
-          <w:i w:val="0"/>
-          <w:sz w:val="22"/>
-        </w:rPr>
-        <w:t>* Results Coaching - Robert Kirby International - 2013</w:t>
-      </w:r>
-    </w:p>
-    <w:p>
-      <w:pPr>
-        <w:spacing w:before="0" w:after="40"/>
-        <w:ind w:left="288"/>
-      </w:pPr>
-      <w:r>
-        <w:rPr>
-          <w:rFonts w:ascii="Calibri" w:hAnsi="Calibri" w:cs="Calibri"/>
-          <w:b w:val="0"/>
-          <w:i w:val="0"/>
-          <w:sz w:val="22"/>
-        </w:rPr>
-        <w:t>* LinkedIn Sales Intensive - Rebel Entrepreneurs - 2012</w:t>
-      </w:r>
-    </w:p>
-    <w:p>
-      <w:pPr>
-        <w:spacing w:before="0" w:after="40"/>
-        <w:ind w:left="288"/>
-      </w:pPr>
-      <w:r>
-        <w:rPr>
-          <w:rFonts w:ascii="Calibri" w:hAnsi="Calibri" w:cs="Calibri"/>
-          <w:b w:val="0"/>
-          <w:i w:val="0"/>
-          <w:sz w:val="22"/>
-        </w:rPr>
-        <w:t>* Present Like a Pro - Authentic Education - 2012</w:t>
-      </w:r>
-    </w:p>
-    <w:p>
-      <w:pPr>
-        <w:spacing w:before="0" w:after="40"/>
-        <w:ind w:left="288"/>
-      </w:pPr>
-      <w:r>
-        <w:rPr>
-          <w:rFonts w:ascii="Calibri" w:hAnsi="Calibri" w:cs="Calibri"/>
-          <w:b w:val="0"/>
-          <w:i w:val="0"/>
-          <w:sz w:val="22"/>
-        </w:rPr>
-        <w:t>* Selling with Integrity - Authentic Education - 2012</w:t>
-      </w:r>
-    </w:p>
-    <w:p>
-      <w:pPr>
-        <w:spacing w:before="0" w:after="40"/>
-        <w:ind w:left="288"/>
-      </w:pPr>
-      <w:r>
-        <w:rPr>
-          <w:rFonts w:ascii="Calibri" w:hAnsi="Calibri" w:cs="Calibri"/>
-          <w:b w:val="0"/>
-          <w:i w:val="0"/>
-          <w:sz w:val="22"/>
-        </w:rPr>
-        <w:t>* Expert Accelerator - Authentic Education - 2012</w:t>
-      </w:r>
-    </w:p>
-    <w:p>
-      <w:pPr>
-        <w:spacing w:before="0" w:after="40"/>
-        <w:ind w:left="288"/>
-      </w:pPr>
-      <w:r>
-        <w:rPr>
-          <w:rFonts w:ascii="Calibri" w:hAnsi="Calibri" w:cs="Calibri"/>
-          <w:b w:val="0"/>
-          <w:i w:val="0"/>
-          <w:sz w:val="22"/>
-        </w:rPr>
-        <w:t>* Certified ScrumMaster - Scrum Alliance - 2011</w:t>
-      </w:r>
-    </w:p>
-    <w:p>
-      <w:pPr>
-        <w:spacing w:before="0" w:after="40"/>
-        <w:ind w:left="288"/>
-      </w:pPr>
-      <w:r>
-        <w:rPr>
-          <w:rFonts w:ascii="Calibri" w:hAnsi="Calibri" w:cs="Calibri"/>
-          <w:b w:val="0"/>
-          <w:i w:val="0"/>
-          <w:sz w:val="22"/>
-        </w:rPr>
-        <w:t>* WhereScape RED Developer - MIP - 2011</w:t>
-      </w:r>
-    </w:p>
-    <w:p>
-      <w:pPr>
-        <w:spacing w:before="0" w:after="40"/>
-        <w:ind w:left="288"/>
-      </w:pPr>
-      <w:r>
-        <w:rPr>
-          <w:rFonts w:ascii="Calibri" w:hAnsi="Calibri" w:cs="Calibri"/>
-          <w:b w:val="0"/>
-          <w:i w:val="0"/>
-          <w:sz w:val="22"/>
-        </w:rPr>
-        <w:t>* Audio Visual (AV) Technician - Thrive Community Church - 2010</w:t>
-      </w:r>
-    </w:p>
-    <w:p>
-      <w:pPr>
-        <w:spacing w:before="0" w:after="40"/>
-        <w:ind w:left="288"/>
-      </w:pPr>
-      <w:r>
-        <w:rPr>
-          <w:rFonts w:ascii="Calibri" w:hAnsi="Calibri" w:cs="Calibri"/>
-          <w:b w:val="0"/>
-          <w:i w:val="0"/>
-          <w:sz w:val="22"/>
-        </w:rPr>
-        <w:t>* Think On Your Feet (Impromptu Speaking) - TOYF International - 2010</w:t>
-      </w:r>
-    </w:p>
-    <w:p>
-      <w:pPr>
-        <w:spacing w:before="0" w:after="40"/>
-        <w:ind w:left="288"/>
-      </w:pPr>
-      <w:r>
-        <w:rPr>
-          <w:rFonts w:ascii="Calibri" w:hAnsi="Calibri" w:cs="Calibri"/>
-          <w:b w:val="0"/>
-          <w:i w:val="0"/>
-          <w:sz w:val="22"/>
-        </w:rPr>
-        <w:t>* Microsoft Certified Professional (SSAS) - Dimension Data - 2009</w:t>
-      </w:r>
-    </w:p>
-    <w:p>
-      <w:pPr>
-        <w:spacing w:before="0" w:after="40"/>
-        <w:ind w:left="288"/>
-      </w:pPr>
-      <w:r>
-        <w:rPr>
-          <w:rFonts w:ascii="Calibri" w:hAnsi="Calibri" w:cs="Calibri"/>
-          <w:b w:val="0"/>
-          <w:i w:val="0"/>
-          <w:sz w:val="22"/>
-        </w:rPr>
-        <w:t>* Financial Services Authority Unit 3 Credit Derivatives - BPP - 2006</w:t>
-      </w:r>
-    </w:p>
-    <w:p>
-      <w:pPr>
-        <w:spacing w:before="0" w:after="40"/>
-        <w:ind w:left="288"/>
-      </w:pPr>
-      <w:r>
-        <w:rPr>
-          <w:rFonts w:ascii="Calibri" w:hAnsi="Calibri" w:cs="Calibri"/>
-          <w:b w:val="0"/>
-          <w:i w:val="0"/>
-          <w:sz w:val="22"/>
-        </w:rPr>
-        <w:t>* Microsoft Certified Application Developer (MCAD) - Microsoft - 2003</w:t>
-      </w:r>
-    </w:p>
-    <w:p>
-      <w:pPr>
-        <w:spacing w:before="240" w:after="120"/>
+        <w:spacing w:before="160" w:after="60"/>
       </w:pPr>
       <w:r>
         <w:rPr>
@@ -3217,63 +2622,35 @@
     </w:p>
     <w:p>
       <w:pPr>
-        <w:spacing w:before="80" w:after="40"/>
-      </w:pPr>
-      <w:r>
-        <w:rPr>
-          <w:rFonts w:ascii="Calibri" w:hAnsi="Calibri" w:cs="Calibri"/>
-          <w:b/>
-          <w:i w:val="0"/>
-          <w:sz w:val="22"/>
-        </w:rPr>
-        <w:t>Soft Skills:</w:t>
-      </w:r>
-    </w:p>
-    <w:p>
-      <w:pPr>
-        <w:spacing w:before="0" w:after="80"/>
+        <w:spacing w:before="0" w:after="40"/>
       </w:pPr>
       <w:r>
         <w:rPr>
           <w:rFonts w:ascii="Calibri" w:hAnsi="Calibri" w:cs="Calibri"/>
           <w:b w:val="0"/>
           <w:i w:val="0"/>
-          <w:sz w:val="22"/>
+          <w:sz w:val="20"/>
         </w:rPr>
-        <w:t>IT Industry (32 yrs), Business Analysis (24 yrs), Data Analysis (23 yrs), Strategy Development (19 yrs), Quality Control (18 yrs), Database Design (17 yrs), Technical Coaching (17 yrs), Process Improvement (17 yrs), Developer Management (17 yrs), Workflow Automation (16 yrs), Solutions Architecture Design (15 yrs), Business Process Modelling (BPM) (15 yrs), Directorship / Governance (14 yrs), Conflict / Dispute Resolution (13 yrs), Stakeholder Engagement (13 yrs), Offshore Management (12 yrs), Public Speaking (12 yrs), Change Management (12 yrs), Business Networking (10 yrs), Workshop Facilitation (10 yrs), Management Consulting (8 yrs), BDM / Sales / Pre-Sales (8 yrs), Financial Markets (8 yrs), Negotiation / Persuasion (8 yrs), Proposal Writing (8 yrs), Scrum Master / Agile Coach (7 yrs)</w:t>
+        <w:t>Soft skills: IT Industry (32 yrs), Business Analysis (24 yrs), Data Analysis (23 yrs), Strategy Development (19 yrs), Quality Control (18 yrs), Database Design (17 yrs), Technical Coaching (17 yrs), Process Improvement (17 yrs), Developer Management (17 yrs), Workflow Automation (16 yrs), Solutions Architecture Design (15 yrs), Business Process Modelling (BPM) (15 yrs), Directorship / Governance (14 yrs), Conflict / Dispute Resolution (13 yrs), Stakeholder Engagement (13 yrs), Offshore Management (12 yrs), Public Speaking (12 yrs), Change Management (12 yrs), Business Networking (10 yrs), Workshop Facilitation (10 yrs), Management Consulting (8 yrs), BDM / Sales / Pre-Sales (8 yrs), Financial Markets (8 yrs), Negotiation / Persuasion (8 yrs), Proposal Writing (8 yrs), Scrum Master / Agile Coach (7 yrs)</w:t>
       </w:r>
     </w:p>
     <w:p>
       <w:pPr>
-        <w:spacing w:before="80" w:after="40"/>
-      </w:pPr>
-      <w:r>
-        <w:rPr>
-          <w:rFonts w:ascii="Calibri" w:hAnsi="Calibri" w:cs="Calibri"/>
-          <w:b/>
-          <w:i w:val="0"/>
-          <w:sz w:val="22"/>
-        </w:rPr>
-        <w:t>Technologies:</w:t>
-      </w:r>
-    </w:p>
-    <w:p>
-      <w:pPr>
-        <w:spacing w:before="0" w:after="80"/>
+        <w:spacing w:before="0" w:after="40"/>
       </w:pPr>
       <w:r>
         <w:rPr>
           <w:rFonts w:ascii="Calibri" w:hAnsi="Calibri" w:cs="Calibri"/>
           <w:b w:val="0"/>
           <w:i w:val="0"/>
-          <w:sz w:val="22"/>
+          <w:sz w:val="20"/>
         </w:rPr>
-        <w:t>SQL Server (19 yrs), Data Migration (SSIS / ETL) (17 yrs), Excel VBA / Access VBA (16 yrs), Linux (CentOS / RHEL / Ubuntu) (14 yrs), SQL Performance Tuning (13 yrs), CSS3 / HTML5 / XML / JSON (12 yrs), PHP / WordPress (11 yrs), Atlassian JIRA (10 yrs), Agile Methodology (9 yrs), Cyber Security (8 yrs), Web Performance Tuning (8 yrs), JavaScript / jQuery (8 yrs), C# .NET (8 yrs), Search Engine Optimisation (7 yrs), Azure / AWS / Google Cloud (6 yrs), Digital Marketing (6 yrs), Shopify / Shopify Plus (5 yrs), DevOps (4 yrs), AI / ML (Claude Code, LLM orchestration) (4 yrs), Salesforce B2C Commerce Cloud (3 yrs), Active Directory (3 yrs), ERPNext (1 yrs), Unified Communications / VOIP (1 yrs)</w:t>
+        <w:t>Technologies: SQL Server (19 yrs), Data Migration (SSIS / ETL) (17 yrs), Excel VBA / Access VBA (16 yrs), Linux (CentOS / RHEL / Ubuntu) (14 yrs), SQL Performance Tuning (13 yrs), CSS3 / HTML5 / XML / JSON (12 yrs), PHP / WordPress (11 yrs), Atlassian JIRA (10 yrs), Agile Methodology (9 yrs), Cyber Security (8 yrs), Web Performance Tuning (8 yrs), JavaScript / jQuery (8 yrs), C# .NET (8 yrs), Search Engine Optimisation (7 yrs), Azure / AWS / Google Cloud (6 yrs), Digital Marketing (6 yrs), Shopify / Shopify Plus (5 yrs), DevOps (4 yrs), AI / ML (Claude Code, LLM orchestration) (4 yrs), Salesforce B2C Commerce Cloud (3 yrs), Active Directory (3 yrs), ERPNext (1 yrs), Unified Communications / VOIP (1 yrs)</w:t>
       </w:r>
     </w:p>
     <w:p>
       <w:pPr>
-        <w:spacing w:before="240" w:after="120"/>
+        <w:spacing w:before="160" w:after="60"/>
       </w:pPr>
       <w:r>
         <w:rPr>
@@ -3287,7 +2664,7 @@
     </w:p>
     <w:p>
       <w:pPr>
-        <w:spacing w:before="0" w:after="40"/>
+        <w:spacing w:before="0" w:after="20"/>
         <w:ind w:left="288"/>
       </w:pPr>
       <w:r>
@@ -3302,7 +2679,7 @@
     </w:p>
     <w:p>
       <w:pPr>
-        <w:spacing w:before="0" w:after="40"/>
+        <w:spacing w:before="0" w:after="20"/>
         <w:ind w:left="288"/>
       </w:pPr>
       <w:r>
@@ -3317,7 +2694,7 @@
     </w:p>
     <w:p>
       <w:pPr>
-        <w:spacing w:before="0" w:after="40"/>
+        <w:spacing w:before="0" w:after="20"/>
         <w:ind w:left="288"/>
       </w:pPr>
       <w:r>
@@ -3332,7 +2709,7 @@
     </w:p>
     <w:p>
       <w:pPr>
-        <w:spacing w:before="0" w:after="40"/>
+        <w:spacing w:before="0" w:after="20"/>
         <w:ind w:left="288"/>
       </w:pPr>
       <w:r>
@@ -3347,7 +2724,7 @@
     </w:p>
     <w:p>
       <w:pPr>
-        <w:spacing w:before="240" w:after="120"/>
+        <w:spacing w:before="160" w:after="60"/>
       </w:pPr>
       <w:r>
         <w:rPr>
@@ -3361,7 +2738,7 @@
     </w:p>
     <w:p>
       <w:pPr>
-        <w:spacing w:before="0" w:after="40"/>
+        <w:spacing w:before="0" w:after="20"/>
         <w:ind w:left="288"/>
       </w:pPr>
       <w:r>
@@ -3376,7 +2753,7 @@
     </w:p>
     <w:p>
       <w:pPr>
-        <w:spacing w:before="0" w:after="40"/>
+        <w:spacing w:before="0" w:after="20"/>
         <w:ind w:left="288"/>
       </w:pPr>
       <w:r>
@@ -3391,7 +2768,7 @@
     </w:p>
     <w:p>
       <w:pPr>
-        <w:spacing w:before="0" w:after="40"/>
+        <w:spacing w:before="0" w:after="20"/>
         <w:ind w:left="288"/>
       </w:pPr>
       <w:r>
@@ -3406,7 +2783,7 @@
     </w:p>
     <w:p>
       <w:pPr>
-        <w:spacing w:before="0" w:after="40"/>
+        <w:spacing w:before="0" w:after="20"/>
         <w:ind w:left="288"/>
       </w:pPr>
       <w:r>
@@ -3421,7 +2798,7 @@
     </w:p>
     <w:p>
       <w:pPr>
-        <w:spacing w:before="240" w:after="120"/>
+        <w:spacing w:before="160" w:after="60"/>
       </w:pPr>
       <w:r>
         <w:rPr>
@@ -3435,7 +2812,7 @@
     </w:p>
     <w:p>
       <w:pPr>
-        <w:spacing w:before="0" w:after="40"/>
+        <w:spacing w:before="0" w:after="20"/>
         <w:ind w:left="288"/>
       </w:pPr>
       <w:r>
@@ -3450,7 +2827,7 @@
     </w:p>
     <w:p>
       <w:pPr>
-        <w:spacing w:before="0" w:after="40"/>
+        <w:spacing w:before="0" w:after="20"/>
         <w:ind w:left="288"/>
       </w:pPr>
       <w:r>
@@ -3465,7 +2842,7 @@
     </w:p>
     <w:p>
       <w:pPr>
-        <w:spacing w:before="0" w:after="40"/>
+        <w:spacing w:before="0" w:after="20"/>
         <w:ind w:left="288"/>
       </w:pPr>
       <w:r>
@@ -3480,7 +2857,7 @@
     </w:p>
     <w:p>
       <w:pPr>
-        <w:spacing w:before="0" w:after="40"/>
+        <w:spacing w:before="0" w:after="20"/>
         <w:ind w:left="288"/>
       </w:pPr>
       <w:r>
@@ -3495,7 +2872,7 @@
     </w:p>
     <w:p>
       <w:pPr>
-        <w:spacing w:before="0" w:after="40"/>
+        <w:spacing w:before="0" w:after="20"/>
         <w:ind w:left="288"/>
       </w:pPr>
       <w:r>
@@ -3510,7 +2887,7 @@
     </w:p>
     <w:p>
       <w:pPr>
-        <w:spacing w:before="0" w:after="40"/>
+        <w:spacing w:before="0" w:after="20"/>
         <w:ind w:left="288"/>
       </w:pPr>
       <w:r>
@@ -3525,7 +2902,7 @@
     </w:p>
     <w:p>
       <w:pPr>
-        <w:spacing w:before="0" w:after="40"/>
+        <w:spacing w:before="0" w:after="20"/>
         <w:ind w:left="288"/>
       </w:pPr>
       <w:r>
@@ -3540,7 +2917,7 @@
     </w:p>
     <w:p>
       <w:pPr>
-        <w:spacing w:before="0" w:after="40"/>
+        <w:spacing w:before="0" w:after="20"/>
         <w:ind w:left="288"/>
       </w:pPr>
       <w:r>
@@ -3555,7 +2932,7 @@
     </w:p>
     <w:p>
       <w:pPr>
-        <w:spacing w:before="0" w:after="40"/>
+        <w:spacing w:before="0" w:after="20"/>
         <w:ind w:left="288"/>
       </w:pPr>
       <w:r>
@@ -3570,7 +2947,7 @@
     </w:p>
     <w:p>
       <w:pPr>
-        <w:spacing w:before="240" w:after="120"/>
+        <w:spacing w:before="160" w:after="60"/>
       </w:pPr>
       <w:r>
         <w:rPr>
@@ -3584,7 +2961,7 @@
     </w:p>
     <w:p>
       <w:pPr>
-        <w:spacing w:before="0" w:after="40"/>
+        <w:spacing w:before="0" w:after="20"/>
         <w:ind w:left="288"/>
       </w:pPr>
       <w:r>
@@ -3599,7 +2976,7 @@
     </w:p>
     <w:p>
       <w:pPr>
-        <w:spacing w:before="0" w:after="40"/>
+        <w:spacing w:before="0" w:after="20"/>
         <w:ind w:left="288"/>
       </w:pPr>
       <w:r>
@@ -3614,7 +2991,7 @@
     </w:p>
     <w:p>
       <w:pPr>
-        <w:spacing w:before="0" w:after="40"/>
+        <w:spacing w:before="0" w:after="20"/>
         <w:ind w:left="288"/>
       </w:pPr>
       <w:r>
@@ -3629,7 +3006,7 @@
     </w:p>
     <w:p>
       <w:pPr>
-        <w:spacing w:before="0" w:after="40"/>
+        <w:spacing w:before="0" w:after="20"/>
         <w:ind w:left="288"/>
       </w:pPr>
       <w:r>
@@ -3644,7 +3021,7 @@
     </w:p>
     <w:p>
       <w:pPr>
-        <w:spacing w:before="0" w:after="40"/>
+        <w:spacing w:before="0" w:after="20"/>
         <w:ind w:left="288"/>
       </w:pPr>
       <w:r>
@@ -3659,7 +3036,7 @@
     </w:p>
     <w:p>
       <w:pPr>
-        <w:spacing w:before="0" w:after="40"/>
+        <w:spacing w:before="0" w:after="20"/>
         <w:ind w:left="288"/>
       </w:pPr>
       <w:r>
@@ -3674,7 +3051,7 @@
     </w:p>
     <w:p>
       <w:pPr>
-        <w:spacing w:before="0" w:after="40"/>
+        <w:spacing w:before="0" w:after="20"/>
         <w:ind w:left="288"/>
       </w:pPr>
       <w:r>
@@ -3689,7 +3066,7 @@
     </w:p>
     <w:p>
       <w:pPr>
-        <w:spacing w:before="0" w:after="40"/>
+        <w:spacing w:before="0" w:after="20"/>
         <w:ind w:left="288"/>
       </w:pPr>
       <w:r>
@@ -3704,7 +3081,7 @@
     </w:p>
     <w:p>
       <w:pPr>
-        <w:spacing w:before="0" w:after="40"/>
+        <w:spacing w:before="0" w:after="20"/>
         <w:ind w:left="288"/>
       </w:pPr>
       <w:r>
@@ -3719,7 +3096,7 @@
     </w:p>
     <w:p>
       <w:pPr>
-        <w:spacing w:before="240" w:after="120"/>
+        <w:spacing w:before="160" w:after="60"/>
       </w:pPr>
       <w:r>
         <w:rPr>
@@ -3733,7 +3110,7 @@
     </w:p>
     <w:p>
       <w:pPr>
-        <w:spacing w:before="0" w:after="40"/>
+        <w:spacing w:before="0" w:after="20"/>
         <w:ind w:left="288"/>
       </w:pPr>
       <w:r>
@@ -3748,7 +3125,7 @@
     </w:p>
     <w:p>
       <w:pPr>
-        <w:spacing w:before="0" w:after="40"/>
+        <w:spacing w:before="0" w:after="20"/>
         <w:ind w:left="288"/>
       </w:pPr>
       <w:r>
@@ -3763,7 +3140,7 @@
     </w:p>
     <w:p>
       <w:pPr>
-        <w:spacing w:before="0" w:after="40"/>
+        <w:spacing w:before="0" w:after="20"/>
         <w:ind w:left="288"/>
       </w:pPr>
       <w:r>
@@ -3778,7 +3155,7 @@
     </w:p>
     <w:p>
       <w:pPr>
-        <w:spacing w:before="0" w:after="40"/>
+        <w:spacing w:before="0" w:after="20"/>
         <w:ind w:left="288"/>
       </w:pPr>
       <w:r>
@@ -3793,7 +3170,7 @@
     </w:p>
     <w:p>
       <w:pPr>
-        <w:spacing w:before="0" w:after="40"/>
+        <w:spacing w:before="0" w:after="20"/>
         <w:ind w:left="288"/>
       </w:pPr>
       <w:r>
@@ -3808,7 +3185,7 @@
     </w:p>
     <w:p>
       <w:pPr>
-        <w:spacing w:before="0" w:after="40"/>
+        <w:spacing w:before="0" w:after="20"/>
         <w:ind w:left="288"/>
       </w:pPr>
       <w:r>
@@ -3823,7 +3200,7 @@
     </w:p>
     <w:p>
       <w:pPr>
-        <w:spacing w:before="0" w:after="40"/>
+        <w:spacing w:before="0" w:after="20"/>
         <w:ind w:left="288"/>
       </w:pPr>
       <w:r>
@@ -3838,7 +3215,7 @@
     </w:p>
     <w:p>
       <w:pPr>
-        <w:spacing w:before="0" w:after="40"/>
+        <w:spacing w:before="0" w:after="20"/>
         <w:ind w:left="288"/>
       </w:pPr>
       <w:r>
@@ -3867,7 +3244,7 @@
     </w:p>
     <w:p>
       <w:pPr>
-        <w:spacing w:before="240" w:after="120"/>
+        <w:spacing w:before="160" w:after="60"/>
       </w:pPr>
       <w:r>
         <w:rPr>

</xml_diff>

<commit_message>
build: regenerate resume artifacts from resume.json
Co-Authored-By: deploy.sh <noreply@paulharvey.com.au>
</commit_message>
<xml_diff>
--- a/cv/docs/Paul Harvey - Resume.docx
+++ b/cv/docs/Paul Harvey - Resume.docx
@@ -428,6 +428,36 @@
           <w:i w:val="0"/>
           <w:sz w:val="22"/>
         </w:rPr>
+        <w:t>* Authored the fleet's AI coding standards - spec-driven (SDD), contract-driven (CDD), and root-cause-driven debugging (RCDD) - enforced through agent task contracts and pre-commit checks. Productised the spec-driven workflow as MinSpec (minspec.dev), a VS Code extension that scales engineering ceremony to change complexity, from one-line specs to full architecture docs, with no AI dependency, backend, or lock-in.</w:t>
+      </w:r>
+    </w:p>
+    <w:p>
+      <w:pPr>
+        <w:spacing w:before="0" w:after="20"/>
+        <w:ind w:left="288"/>
+      </w:pPr>
+      <w:r>
+        <w:rPr>
+          <w:rFonts w:ascii="Calibri" w:hAnsi="Calibri" w:cs="Calibri"/>
+          <w:b w:val="0"/>
+          <w:i w:val="0"/>
+          <w:sz w:val="22"/>
+        </w:rPr>
+        <w:t>* Built ScroogeLLM (scroogellm.com) - VS Code extension that cuts LLM costs while improving quality via an LLM proxy, prompt compression, and agent escalation, with full savings visibility. Customers pay only a percentage of measured savings.</w:t>
+      </w:r>
+    </w:p>
+    <w:p>
+      <w:pPr>
+        <w:spacing w:before="0" w:after="20"/>
+        <w:ind w:left="288"/>
+      </w:pPr>
+      <w:r>
+        <w:rPr>
+          <w:rFonts w:ascii="Calibri" w:hAnsi="Calibri" w:cs="Calibri"/>
+          <w:b w:val="0"/>
+          <w:i w:val="0"/>
+          <w:sz w:val="22"/>
+        </w:rPr>
         <w:t>* Built ERPChat - voice-first ERP Android client (Kotlin, Jetpack Compose). HITL approval gating, OpenCV on-device document auto-crop, ElevenLabs streamed TTS, SQLCipher-encrypted storage, UnifiedPush notifications. Open-sourced under Apache-2.0.</w:t>
       </w:r>
     </w:p>
@@ -3286,7 +3316,7 @@
           <w:i/>
           <w:sz w:val="18"/>
         </w:rPr>
-        <w:t>Live interactive resume: https://paulharvey.com.au | Updated 2026-05-30 | Source: resume.json v20260530.4</w:t>
+        <w:t>Live interactive resume: https://paulharvey.com.au | Updated 2026-06-01 | Source: resume.json v20260601.1</w:t>
       </w:r>
     </w:p>
     <w:sectPr>

</xml_diff>

<commit_message>
content: cut em-dashes from resume + site (reduce AI-content tell)
Em-dash overuse is a top stylometric flag for AI-generated prose and a
recruiter smell-test trigger. Removed all 45 em-dashes from rendered
output:

- resume.json: 43 occurrences -> colon / comma / parentheses / semicolon
  for prose; " - " for "Name — Org" titles; ":" for meta.paul schema docs.
  Meaning preserved (verified: each replacement unique, JSON still parses).
- index.html: title/description/og/twitter/JSON-LD/alt "Paul Harvey — …"
  -> comma; "Skills Matrix —" -> colon. Code comments left (not rendered).
- Metadata doc titles switched em-dash -> hyphen to match the filenames
  ("Paul Harvey - Resume").

Rendered artifacts rebuilt and verified em-dash-free (PDF glyph scan +
DOCX document.xml both 0). DOCX was already clean via to_ascii.

resume.json version 20260601.2 -> .3.

Co-Authored-By: Claude Opus 4.8 (1M context) <noreply@anthropic.com>
</commit_message>
<xml_diff>
--- a/cv/docs/Paul Harvey - Resume.docx
+++ b/cv/docs/Paul Harvey - Resume.docx
@@ -107,7 +107,7 @@
           <w:i w:val="0"/>
           <w:sz w:val="22"/>
         </w:rPr>
-        <w:t>* 17 yrs - Managing developers - 260+ hired, including offshore teams and AI agent fleets</w:t>
+        <w:t>* 17 yrs - Managing developers: 260+ hired, including offshore teams and AI agent fleets</w:t>
       </w:r>
     </w:p>
     <w:p>
@@ -222,7 +222,7 @@
           <w:i w:val="0"/>
           <w:sz w:val="22"/>
         </w:rPr>
-        <w:t>Key strengths: End-to-End Solution Architect: Apps - Data - Integration - Cloud | AI Strategy + Enterprise LLM Integration (48-agent Claude Code fleet) | 10 Years in Financial Services - RBA, APRA, banks | Salesforce B2C Commerce Cloud + Shopify Plus | CTO / IT Manager / Solutions Architect - PandL, Board, ERP transformation | Distributed + Offshore Team Leadership (260+ staff hired) | Pre-Sales - Bids - SOWs - RFPs | ITIL - Scrum - TOGAF-aligned - Microsoft - Google certified</w:t>
+        <w:t>Key strengths: End-to-End Solution Architect: Apps - Data - Integration - Cloud | AI Strategy + Enterprise LLM Integration (48-agent Claude Code fleet) | 10 Years in Financial Services: RBA, APRA, banks | Salesforce B2C Commerce Cloud + Shopify Plus | CTO / IT Manager / Solutions Architect: PandL, Board, ERP transformation | Distributed + Offshore Team Leadership (260+ staff hired) | Pre-Sales - Bids - SOWs - RFPs | ITIL - Scrum - TOGAF-aligned - Microsoft - Google certified</w:t>
       </w:r>
     </w:p>
     <w:p>
@@ -323,7 +323,7 @@
           <w:i w:val="0"/>
           <w:sz w:val="22"/>
         </w:rPr>
-        <w:t>* Created an Autofix Agents team - monitor, triage, architect, developer, QA, security - that reliably resolves production issues across all projects. [48,700+ issues - 94.5% success]</w:t>
+        <w:t>* Created an Autofix Agents team (monitor, triage, architect, developer, QA, security) that reliably resolves production issues across all projects. [48,700+ issues - 94.5% success]</w:t>
       </w:r>
     </w:p>
     <w:p>
@@ -383,7 +383,7 @@
           <w:i w:val="0"/>
           <w:sz w:val="22"/>
         </w:rPr>
-        <w:t>* Built ContactReplyAI.com - AI virtual assistant SaaS for tradies with insurance-compliant human-in-the-loop template approval.</w:t>
+        <w:t>* Built ContactReplyAI.com, an AI virtual assistant SaaS for tradies with insurance-compliant human-in-the-loop template approval.</w:t>
       </w:r>
     </w:p>
     <w:p>
@@ -398,7 +398,7 @@
           <w:i w:val="0"/>
           <w:sz w:val="22"/>
         </w:rPr>
-        <w:t>* Designed AdManager - multi-project ad platform connecting Google Ads, Meta, TikTok with LLM-driven creative generation, strategy, and multivariate split testing.</w:t>
+        <w:t>* Designed AdManager, a multi-project ad platform connecting Google Ads, Meta, TikTok with LLM-driven creative generation, strategy, and multivariate split testing.</w:t>
       </w:r>
     </w:p>
     <w:p>
@@ -413,7 +413,7 @@
           <w:i w:val="0"/>
           <w:sz w:val="22"/>
         </w:rPr>
-        <w:t>* Launched Colormora.com - AI colouring-book SaaS on Base44. React/Vite front end, Stripe subscription billing, Cloudflare Worker backend.</w:t>
+        <w:t>* Launched Colormora.com, an AI colouring-book SaaS on Base44. React/Vite front end, Stripe subscription billing, Cloudflare Worker backend.</w:t>
       </w:r>
     </w:p>
     <w:p>
@@ -428,7 +428,7 @@
           <w:i w:val="0"/>
           <w:sz w:val="22"/>
         </w:rPr>
-        <w:t>* Authored the fleet's AI coding standards - spec-driven (SDD), contract-driven (CDD), and root-cause-driven debugging (RCDD) - enforced through agent task contracts and pre-commit checks. Productised the spec-driven workflow as MinSpec (minspec.dev), a VS Code extension that scales engineering ceremony to change complexity, from one-line specs to full architecture docs, with no AI dependency, backend, or lock-in.</w:t>
+        <w:t>* Authored the fleet's AI coding standards: spec-driven (SDD), contract-driven (CDD), and root-cause-driven debugging (RCDD), enforced through agent task contracts and pre-commit checks. Productised the spec-driven workflow as MinSpec (minspec.dev), a VS Code extension that scales engineering ceremony to change complexity, from one-line specs to full architecture docs, with no AI dependency, backend, or lock-in.</w:t>
       </w:r>
     </w:p>
     <w:p>
@@ -443,7 +443,7 @@
           <w:i w:val="0"/>
           <w:sz w:val="22"/>
         </w:rPr>
-        <w:t>* Built ScroogeLLM (scroogellm.com) - VS Code extension that cuts LLM costs while improving quality via an LLM proxy, prompt compression, and agent escalation, with full savings visibility. Customers pay only a percentage of measured savings.</w:t>
+        <w:t>* Built ScroogeLLM (scroogellm.com), a VS Code extension that cuts LLM costs while improving quality via an LLM proxy, prompt compression, and agent escalation, with full savings visibility. Customers pay only a percentage of measured savings.</w:t>
       </w:r>
     </w:p>
     <w:p>
@@ -458,7 +458,7 @@
           <w:i w:val="0"/>
           <w:sz w:val="22"/>
         </w:rPr>
-        <w:t>* Built ERPChat - voice-first ERP Android client (Kotlin, Jetpack Compose). HITL approval gating, OpenCV on-device document auto-crop, ElevenLabs streamed TTS, SQLCipher-encrypted storage, UnifiedPush notifications. Open-sourced under Apache-2.0.</w:t>
+        <w:t>* Built ERPChat, a voice-first ERP Android client (Kotlin, Jetpack Compose). HITL approval gating, OpenCV on-device document auto-crop, ElevenLabs streamed TTS, SQLCipher-encrypted storage, UnifiedPush notifications. Open-sourced under Apache-2.0.</w:t>
       </w:r>
     </w:p>
     <w:p>
@@ -503,7 +503,7 @@
           <w:i w:val="0"/>
           <w:sz w:val="22"/>
         </w:rPr>
-        <w:t>* Built auditandfix.com video reviews - unique 30-second marketing videos generated cheaply enough to send to every prospect. [$0.11 / video]</w:t>
+        <w:t>* Built auditandfix.com video reviews: unique 30-second marketing videos generated cheaply enough to send to every prospect. [$0.11 / video]</w:t>
       </w:r>
     </w:p>
     <w:p>
@@ -518,7 +518,7 @@
           <w:i w:val="0"/>
           <w:sz w:val="22"/>
         </w:rPr>
-        <w:t>* Autonomous SERP-to-outreach pipeline - Playwright browser automation, adaptive concurrency, GDPR/TCPA gating, country localisation. [~8,900 outreaches]</w:t>
+        <w:t>* Autonomous SERP-to-outreach pipeline: Playwright browser automation, adaptive concurrency, GDPR/TCPA gating, country localisation. [~8,900 outreaches]</w:t>
       </w:r>
     </w:p>
     <w:p>
@@ -1059,7 +1059,7 @@
           <w:i w:val="0"/>
           <w:sz w:val="22"/>
         </w:rPr>
-        <w:t>* Managed up to 15 developers across Sydney, Wellington and Jakarta - SQL, .NET, web, VOIP engineers, print managers.</w:t>
+        <w:t>* Managed up to 15 developers across Sydney, Wellington and Jakarta: SQL, .NET, web, VOIP engineers, print managers.</w:t>
       </w:r>
     </w:p>
     <w:p>
@@ -1584,7 +1584,7 @@
           <w:i w:val="0"/>
           <w:sz w:val="22"/>
         </w:rPr>
-        <w:t>* First system to connect inmates with the outside world - strong cybersecurity focus.</w:t>
+        <w:t>* First system to connect inmates with the outside world; strong cybersecurity focus.</w:t>
       </w:r>
     </w:p>
     <w:p>
@@ -1657,7 +1657,7 @@
           <w:i w:val="0"/>
           <w:sz w:val="22"/>
         </w:rPr>
-        <w:t>* Comprehensive System Architecture covering development, deployment and ongoing management - infrastructure, workflow, functionality, data, traffic generation; performance, reliability, scalability, compliance, security.</w:t>
+        <w:t>* Comprehensive System Architecture covering development, deployment and ongoing management: infrastructure, workflow, functionality, data, traffic generation; performance, reliability, scalability, compliance, security.</w:t>
       </w:r>
     </w:p>
     <w:p>
@@ -1687,7 +1687,7 @@
           <w:i w:val="0"/>
           <w:sz w:val="22"/>
         </w:rPr>
-        <w:t>* Successfully debated a major platform change with CEO and key client stakeholders - cut delivery time 25%, reduced maintenance costs 20%.</w:t>
+        <w:t>* Successfully debated a major platform change with CEO and key client stakeholders: cut delivery time 25%, reduced maintenance costs 20%.</w:t>
       </w:r>
     </w:p>
     <w:p>
@@ -2153,7 +2153,7 @@
           <w:i w:val="0"/>
           <w:sz w:val="22"/>
         </w:rPr>
-        <w:t>* High-intensity role - every minute of downtime could cost GBP60,000.</w:t>
+        <w:t>* High-intensity role: every minute of downtime could cost GBP60,000.</w:t>
       </w:r>
     </w:p>
     <w:p>
@@ -2342,7 +2342,7 @@
           <w:i w:val="0"/>
           <w:sz w:val="22"/>
         </w:rPr>
-        <w:t>* Designed an SOE upgrade process that delivered 4 weeks of migration work in 5 minutes of downtime - 24-hour change freeze, 90-second back-out plan.</w:t>
+        <w:t>* Designed an SOE upgrade process that delivered 4 weeks of migration work in 5 minutes of downtime: 24-hour change freeze, 90-second back-out plan.</w:t>
       </w:r>
     </w:p>
     <w:p>
@@ -2867,7 +2867,7 @@
           <w:i w:val="0"/>
           <w:sz w:val="22"/>
         </w:rPr>
-        <w:t>* Audit and Fix - CRO Audits (https://auditandfix.com) - Automated Conversion Rate Optimisation audits - with cold outreach, screenshots and prioritised fixes.</w:t>
+        <w:t>* Audit and Fix - CRO Audits (https://auditandfix.com) - Automated Conversion Rate Optimisation audits with cold outreach, screenshots and prioritised fixes.</w:t>
       </w:r>
     </w:p>
     <w:p>
@@ -2927,7 +2927,7 @@
           <w:i w:val="0"/>
           <w:sz w:val="22"/>
         </w:rPr>
-        <w:t>* MinSpec (https://minspec.dev) - VS Code extension that scales spec-driven-development ceremony to change complexity - one sentence for trivial tasks, full architecture docs for big ones. No AI dependency, no backend, no lock-in.</w:t>
+        <w:t>* MinSpec (https://minspec.dev) - VS Code extension that scales spec-driven-development ceremony to change complexity: one sentence for trivial tasks, full architecture docs for big ones. No AI dependency, no backend, no lock-in.</w:t>
       </w:r>
     </w:p>
     <w:p>
@@ -2942,7 +2942,7 @@
           <w:i w:val="0"/>
           <w:sz w:val="22"/>
         </w:rPr>
-        <w:t>* ScroogeLLM (https://scroogellm.com) - VS Code extension that cuts LLM costs while improving quality - LLM proxy, prompt compression, agent escalation, and full savings visibility. You only pay a percentage of how much we save you.</w:t>
+        <w:t>* ScroogeLLM (https://scroogellm.com) - VS Code extension that cuts LLM costs while improving quality via an LLM proxy, prompt compression, agent escalation, and full savings visibility. You only pay a percentage of how much we save you.</w:t>
       </w:r>
     </w:p>
     <w:p>
@@ -2972,7 +2972,7 @@
           <w:i w:val="0"/>
           <w:sz w:val="22"/>
         </w:rPr>
-        <w:t>* pageload-timer (https://harvest316.github.io/pageload-timer/) - Sample project - NodeJS / Express.js web service that downloads a list of pages and returns pageload latencies. Demonstrates BDD unit tests in Mocha / Chai / Expect.js, continuously deployed on Heroku via Grunt + Travis CI.</w:t>
+        <w:t>* pageload-timer (https://harvest316.github.io/pageload-timer/) - Sample project: NodeJS / Express.js web service that downloads a list of pages and returns pageload latencies. Demonstrates BDD unit tests in Mocha / Chai / Expect.js, continuously deployed on Heroku via Grunt + Travis CI.</w:t>
       </w:r>
     </w:p>
     <w:p>
@@ -3316,7 +3316,7 @@
           <w:i/>
           <w:sz w:val="18"/>
         </w:rPr>
-        <w:t>Live interactive resume: https://paulharvey.com.au | Updated 2026-06-01 | Source: resume.json v20260601.2</w:t>
+        <w:t>Live interactive resume: https://paulharvey.com.au | Updated 2026-06-01 | Source: resume.json v20260601.3</w:t>
       </w:r>
     </w:p>
     <w:sectPr>

</xml_diff>